<commit_message>
changes to the manual
</commit_message>
<xml_diff>
--- a/Manual hex coven.docx
+++ b/Manual hex coven.docx
@@ -1,6 +1,6 @@
 
 <file path=word/document.xml><?xml version="1.0" encoding="utf-8"?>
-<w:document xmlns:wpc="http://schemas.microsoft.com/office/word/2010/wordprocessingCanvas" xmlns:cx="http://schemas.microsoft.com/office/drawing/2014/chartex" xmlns:cx1="http://schemas.microsoft.com/office/drawing/2015/9/8/chartex" xmlns:cx2="http://schemas.microsoft.com/office/drawing/2015/10/21/chartex" xmlns:cx3="http://schemas.microsoft.com/office/drawing/2016/5/9/chartex" xmlns:cx4="http://schemas.microsoft.com/office/drawing/2016/5/10/chartex" xmlns:cx5="http://schemas.microsoft.com/office/drawing/2016/5/11/chartex" xmlns:cx6="http://schemas.microsoft.com/office/drawing/2016/5/12/chartex" xmlns:cx7="http://schemas.microsoft.com/office/drawing/2016/5/13/chartex" xmlns:cx8="http://schemas.microsoft.com/office/drawing/2016/5/14/chartex" xmlns:mc="http://schemas.openxmlformats.org/markup-compatibility/2006" xmlns:aink="http://schemas.microsoft.com/office/drawing/2016/ink" xmlns:am3d="http://schemas.microsoft.com/office/drawing/2017/model3d" xmlns:o="urn:schemas-microsoft-com:office:office" xmlns:oel="http://schemas.microsoft.com/office/2019/extlst" xmlns:r="http://schemas.openxmlformats.org/officeDocument/2006/relationships" xmlns:m="http://schemas.openxmlformats.org/officeDocument/2006/math" xmlns:v="urn:schemas-microsoft-com:vml" xmlns:wp14="http://schemas.microsoft.com/office/word/2010/wordprocessingDrawing" xmlns:wp="http://schemas.openxmlformats.org/drawingml/2006/wordprocessingDrawing" xmlns:w10="urn:schemas-microsoft-com:office:word" xmlns:w="http://schemas.openxmlformats.org/wordprocessingml/2006/main" xmlns:w14="http://schemas.microsoft.com/office/word/2010/wordml" xmlns:w15="http://schemas.microsoft.com/office/word/2012/wordml" xmlns:w16cei="http://schemas.microsoft.com/office/word/2026/wordml/cei" xmlns:w16cex="http://schemas.microsoft.com/office/word/2018/wordml/cex" xmlns:w16cid="http://schemas.microsoft.com/office/word/2016/wordml/cid" xmlns:w16="http://schemas.microsoft.com/office/word/2018/wordml" xmlns:w16du="http://schemas.microsoft.com/office/word/2023/wordml/word16du" xmlns:w16sdtdh="http://schemas.microsoft.com/office/word/2020/wordml/sdtdatahash" xmlns:w16sdtfl="http://schemas.microsoft.com/office/word/2024/wordml/sdtformatlock" xmlns:w16se="http://schemas.microsoft.com/office/word/2015/wordml/symex" xmlns:wpg="http://schemas.microsoft.com/office/word/2010/wordprocessingGroup" xmlns:wpi="http://schemas.microsoft.com/office/word/2010/wordprocessingInk" xmlns:wne="http://schemas.microsoft.com/office/word/2006/wordml" xmlns:wps="http://schemas.microsoft.com/office/word/2010/wordprocessingShape" mc:Ignorable="w14 w15 w16se w16cid w16 w16cex w16sdtdh w16sdtfl w16du wp14">
+<w:document xmlns:wpc="http://schemas.microsoft.com/office/word/2010/wordprocessingCanvas" xmlns:cx="http://schemas.microsoft.com/office/drawing/2014/chartex" xmlns:cx1="http://schemas.microsoft.com/office/drawing/2015/9/8/chartex" xmlns:cx2="http://schemas.microsoft.com/office/drawing/2015/10/21/chartex" xmlns:cx3="http://schemas.microsoft.com/office/drawing/2016/5/9/chartex" xmlns:cx4="http://schemas.microsoft.com/office/drawing/2016/5/10/chartex" xmlns:cx5="http://schemas.microsoft.com/office/drawing/2016/5/11/chartex" xmlns:cx6="http://schemas.microsoft.com/office/drawing/2016/5/12/chartex" xmlns:cx7="http://schemas.microsoft.com/office/drawing/2016/5/13/chartex" xmlns:cx8="http://schemas.microsoft.com/office/drawing/2016/5/14/chartex" xmlns:mc="http://schemas.openxmlformats.org/markup-compatibility/2006" xmlns:aink="http://schemas.microsoft.com/office/drawing/2016/ink" xmlns:am3d="http://schemas.microsoft.com/office/drawing/2017/model3d" xmlns:o="urn:schemas-microsoft-com:office:office" xmlns:oel="http://schemas.microsoft.com/office/2019/extlst" xmlns:r="http://schemas.openxmlformats.org/officeDocument/2006/relationships" xmlns:m="http://schemas.openxmlformats.org/officeDocument/2006/math" xmlns:v="urn:schemas-microsoft-com:vml" xmlns:wp14="http://schemas.microsoft.com/office/word/2010/wordprocessingDrawing" xmlns:wp="http://schemas.openxmlformats.org/drawingml/2006/wordprocessingDrawing" xmlns:w10="urn:schemas-microsoft-com:office:word" xmlns:w="http://schemas.openxmlformats.org/wordprocessingml/2006/main" xmlns:w14="http://schemas.microsoft.com/office/word/2010/wordml" xmlns:w15="http://schemas.microsoft.com/office/word/2012/wordml" xmlns:w16cex="http://schemas.microsoft.com/office/word/2018/wordml/cex" xmlns:w16cid="http://schemas.microsoft.com/office/word/2016/wordml/cid" xmlns:w16="http://schemas.microsoft.com/office/word/2018/wordml" xmlns:w16du="http://schemas.microsoft.com/office/word/2023/wordml/word16du" xmlns:w16sdtdh="http://schemas.microsoft.com/office/word/2020/wordml/sdtdatahash" xmlns:w16sdtfl="http://schemas.microsoft.com/office/word/2024/wordml/sdtformatlock" xmlns:w16se="http://schemas.microsoft.com/office/word/2015/wordml/symex" xmlns:wpg="http://schemas.microsoft.com/office/word/2010/wordprocessingGroup" xmlns:wpi="http://schemas.microsoft.com/office/word/2010/wordprocessingInk" xmlns:wne="http://schemas.microsoft.com/office/word/2006/wordml" xmlns:wps="http://schemas.microsoft.com/office/word/2010/wordprocessingShape" mc:Ignorable="w14 w15 w16se w16cid w16 w16cex w16sdtdh w16sdtfl w16du wp14">
   <w:body>
     <w:p>
       <w:pPr>
@@ -13,21 +13,7 @@
         <w:rPr>
           <w:rFonts w:ascii="Calibri Light" w:hAnsi="Calibri Light" w:cs="Calibri Light"/>
         </w:rPr>
-        <w:t xml:space="preserve">Manual </w:t>
-      </w:r>
-      <w:proofErr w:type="spellStart"/>
-      <w:r>
-        <w:rPr>
-          <w:rFonts w:ascii="Calibri Light" w:hAnsi="Calibri Light" w:cs="Calibri Light"/>
-        </w:rPr>
-        <w:t>hex</w:t>
-      </w:r>
-      <w:proofErr w:type="spellEnd"/>
-      <w:r>
-        <w:rPr>
-          <w:rFonts w:ascii="Calibri Light" w:hAnsi="Calibri Light" w:cs="Calibri Light"/>
-        </w:rPr>
-        <w:t xml:space="preserve"> coven</w:t>
+        <w:t>Manual hex coven</w:t>
       </w:r>
     </w:p>
     <w:p>
@@ -54,7 +40,6 @@
           <w:rFonts w:ascii="Calibri Light" w:hAnsi="Calibri Light" w:cs="Calibri Light"/>
         </w:rPr>
       </w:pPr>
-      <w:proofErr w:type="spellStart"/>
       <w:r>
         <w:rPr>
           <w:rFonts w:ascii="Calibri Light" w:hAnsi="Calibri Light" w:cs="Calibri Light"/>
@@ -62,22 +47,20 @@
         <w:lastRenderedPageBreak/>
         <w:t>Indice</w:t>
       </w:r>
-      <w:proofErr w:type="spellEnd"/>
-    </w:p>
-    <w:p>
-      <w:pPr>
-        <w:rPr>
-          <w:rFonts w:ascii="Calibri Light" w:hAnsi="Calibri Light" w:cs="Calibri Light"/>
-        </w:rPr>
-      </w:pPr>
-    </w:p>
-    <w:p>
-      <w:pPr>
-        <w:rPr>
-          <w:rFonts w:ascii="Calibri Light" w:hAnsi="Calibri Light" w:cs="Calibri Light"/>
-        </w:rPr>
-      </w:pPr>
-      <w:proofErr w:type="gramStart"/>
+    </w:p>
+    <w:p>
+      <w:pPr>
+        <w:rPr>
+          <w:rFonts w:ascii="Calibri Light" w:hAnsi="Calibri Light" w:cs="Calibri Light"/>
+        </w:rPr>
+      </w:pPr>
+    </w:p>
+    <w:p>
+      <w:pPr>
+        <w:rPr>
+          <w:rFonts w:ascii="Calibri Light" w:hAnsi="Calibri Light" w:cs="Calibri Light"/>
+        </w:rPr>
+      </w:pPr>
       <w:r>
         <w:rPr>
           <w:rFonts w:ascii="Calibri Light" w:hAnsi="Calibri Light" w:cs="Calibri Light"/>
@@ -88,14 +71,7 @@
         <w:rPr>
           <w:rFonts w:ascii="Calibri Light" w:hAnsi="Calibri Light" w:cs="Calibri Light"/>
         </w:rPr>
-        <w:t>Introducción</w:t>
-      </w:r>
-      <w:proofErr w:type="gramEnd"/>
-      <w:r>
-        <w:rPr>
-          <w:rFonts w:ascii="Calibri Light" w:hAnsi="Calibri Light" w:cs="Calibri Light"/>
-        </w:rPr>
-        <w:t xml:space="preserve"> (Lore QR y objetivos del juego)</w:t>
+        <w:t>Introducción (Lore QR y objetivos del juego)</w:t>
       </w:r>
     </w:p>
     <w:p>
@@ -110,215 +86,125 @@
         </w:rPr>
         <w:t xml:space="preserve">2 </w:t>
       </w:r>
-      <w:proofErr w:type="spellStart"/>
-      <w:r>
-        <w:rPr>
-          <w:rFonts w:ascii="Calibri Light" w:hAnsi="Calibri Light" w:cs="Calibri Light"/>
-        </w:rPr>
-        <w:t>Component</w:t>
-      </w:r>
-      <w:proofErr w:type="spellEnd"/>
+      <w:r>
+        <w:rPr>
+          <w:rFonts w:ascii="Calibri Light" w:hAnsi="Calibri Light" w:cs="Calibri Light"/>
+        </w:rPr>
+        <w:t>Component lis</w:t>
+      </w:r>
+      <w:r>
+        <w:rPr>
+          <w:rFonts w:ascii="Calibri Light" w:hAnsi="Calibri Light" w:cs="Calibri Light"/>
+        </w:rPr>
+        <w:t>t</w:t>
+      </w:r>
+    </w:p>
+    <w:p>
+      <w:pPr>
+        <w:rPr>
+          <w:rFonts w:ascii="Calibri Light" w:hAnsi="Calibri Light" w:cs="Calibri Light"/>
+        </w:rPr>
+      </w:pPr>
+      <w:r>
+        <w:rPr>
+          <w:rFonts w:ascii="Calibri Light" w:hAnsi="Calibri Light" w:cs="Calibri Light"/>
+        </w:rPr>
+        <w:t>2.5(¿) modos de juego (num jugadores + dificultad)</w:t>
+      </w:r>
+    </w:p>
+    <w:p>
+      <w:pPr>
+        <w:rPr>
+          <w:rFonts w:ascii="Calibri Light" w:hAnsi="Calibri Light" w:cs="Calibri Light"/>
+        </w:rPr>
+      </w:pPr>
+      <w:r>
+        <w:rPr>
+          <w:rFonts w:ascii="Calibri Light" w:hAnsi="Calibri Light" w:cs="Calibri Light"/>
+        </w:rPr>
+        <w:t xml:space="preserve">3 </w:t>
+      </w:r>
+      <w:r>
+        <w:rPr>
+          <w:rFonts w:ascii="Calibri Light" w:hAnsi="Calibri Light" w:cs="Calibri Light"/>
+        </w:rPr>
+        <w:t>Cómo preparar la mesa</w:t>
+      </w:r>
+    </w:p>
+    <w:p>
+      <w:pPr>
+        <w:rPr>
+          <w:rFonts w:ascii="Calibri Light" w:hAnsi="Calibri Light" w:cs="Calibri Light"/>
+        </w:rPr>
+      </w:pPr>
+      <w:r>
+        <w:rPr>
+          <w:rFonts w:ascii="Calibri Light" w:hAnsi="Calibri Light" w:cs="Calibri Light"/>
+        </w:rPr>
+        <w:t xml:space="preserve">4 </w:t>
+      </w:r>
+      <w:r>
+        <w:rPr>
+          <w:rFonts w:ascii="Calibri Light" w:hAnsi="Calibri Light" w:cs="Calibri Light"/>
+        </w:rPr>
+        <w:t>Flujo de ronda</w:t>
+      </w:r>
+    </w:p>
+    <w:p>
+      <w:pPr>
+        <w:rPr>
+          <w:rFonts w:ascii="Calibri Light" w:hAnsi="Calibri Light" w:cs="Calibri Light"/>
+        </w:rPr>
+      </w:pPr>
+      <w:r>
+        <w:rPr>
+          <w:rFonts w:ascii="Calibri Light" w:hAnsi="Calibri Light" w:cs="Calibri Light"/>
+        </w:rPr>
+        <w:t xml:space="preserve">5 </w:t>
+      </w:r>
+      <w:r>
+        <w:rPr>
+          <w:rFonts w:ascii="Calibri Light" w:hAnsi="Calibri Light" w:cs="Calibri Light"/>
+        </w:rPr>
+        <w:t>Acciones de jugador (caminar, atacar e intercambiar)</w:t>
+      </w:r>
+    </w:p>
+    <w:p>
+      <w:pPr>
+        <w:rPr>
+          <w:rFonts w:ascii="Calibri Light" w:hAnsi="Calibri Light" w:cs="Calibri Light"/>
+        </w:rPr>
+      </w:pPr>
+      <w:r>
+        <w:rPr>
+          <w:rFonts w:ascii="Calibri Light" w:hAnsi="Calibri Light" w:cs="Calibri Light"/>
+        </w:rPr>
+        <w:t>6</w:t>
+      </w:r>
       <w:r>
         <w:rPr>
           <w:rFonts w:ascii="Calibri Light" w:hAnsi="Calibri Light" w:cs="Calibri Light"/>
         </w:rPr>
         <w:t xml:space="preserve"> </w:t>
       </w:r>
-      <w:proofErr w:type="spellStart"/>
-      <w:r>
-        <w:rPr>
-          <w:rFonts w:ascii="Calibri Light" w:hAnsi="Calibri Light" w:cs="Calibri Light"/>
-        </w:rPr>
-        <w:t>lis</w:t>
-      </w:r>
-      <w:r>
-        <w:rPr>
-          <w:rFonts w:ascii="Calibri Light" w:hAnsi="Calibri Light" w:cs="Calibri Light"/>
-        </w:rPr>
-        <w:t>t</w:t>
-      </w:r>
-      <w:proofErr w:type="spellEnd"/>
-    </w:p>
-    <w:p>
-      <w:pPr>
-        <w:rPr>
-          <w:rFonts w:ascii="Calibri Light" w:hAnsi="Calibri Light" w:cs="Calibri Light"/>
-        </w:rPr>
-      </w:pPr>
-      <w:r>
-        <w:rPr>
-          <w:rFonts w:ascii="Calibri Light" w:hAnsi="Calibri Light" w:cs="Calibri Light"/>
-        </w:rPr>
-        <w:t>2.5(¿) modos de juego (</w:t>
-      </w:r>
-      <w:proofErr w:type="spellStart"/>
-      <w:r>
-        <w:rPr>
-          <w:rFonts w:ascii="Calibri Light" w:hAnsi="Calibri Light" w:cs="Calibri Light"/>
-        </w:rPr>
-        <w:t>num</w:t>
-      </w:r>
-      <w:proofErr w:type="spellEnd"/>
-      <w:r>
-        <w:rPr>
-          <w:rFonts w:ascii="Calibri Light" w:hAnsi="Calibri Light" w:cs="Calibri Light"/>
-        </w:rPr>
-        <w:t xml:space="preserve"> jugadores + dificultad)</w:t>
-      </w:r>
-    </w:p>
-    <w:p>
-      <w:pPr>
-        <w:rPr>
-          <w:rFonts w:ascii="Calibri Light" w:hAnsi="Calibri Light" w:cs="Calibri Light"/>
-        </w:rPr>
-      </w:pPr>
-      <w:r>
-        <w:rPr>
-          <w:rFonts w:ascii="Calibri Light" w:hAnsi="Calibri Light" w:cs="Calibri Light"/>
-        </w:rPr>
-        <w:t xml:space="preserve">3 </w:t>
-      </w:r>
-      <w:proofErr w:type="gramStart"/>
-      <w:r>
-        <w:rPr>
-          <w:rFonts w:ascii="Calibri Light" w:hAnsi="Calibri Light" w:cs="Calibri Light"/>
-        </w:rPr>
-        <w:t>Cómo</w:t>
-      </w:r>
-      <w:proofErr w:type="gramEnd"/>
-      <w:r>
-        <w:rPr>
-          <w:rFonts w:ascii="Calibri Light" w:hAnsi="Calibri Light" w:cs="Calibri Light"/>
-        </w:rPr>
-        <w:t xml:space="preserve"> preparar la mesa</w:t>
-      </w:r>
-    </w:p>
-    <w:p>
-      <w:pPr>
-        <w:rPr>
-          <w:rFonts w:ascii="Calibri Light" w:hAnsi="Calibri Light" w:cs="Calibri Light"/>
-        </w:rPr>
-      </w:pPr>
-      <w:r>
-        <w:rPr>
-          <w:rFonts w:ascii="Calibri Light" w:hAnsi="Calibri Light" w:cs="Calibri Light"/>
-        </w:rPr>
-        <w:t xml:space="preserve">4 </w:t>
-      </w:r>
-      <w:proofErr w:type="gramStart"/>
-      <w:r>
-        <w:rPr>
-          <w:rFonts w:ascii="Calibri Light" w:hAnsi="Calibri Light" w:cs="Calibri Light"/>
-        </w:rPr>
-        <w:t>Flujo</w:t>
-      </w:r>
-      <w:proofErr w:type="gramEnd"/>
-      <w:r>
-        <w:rPr>
-          <w:rFonts w:ascii="Calibri Light" w:hAnsi="Calibri Light" w:cs="Calibri Light"/>
-        </w:rPr>
-        <w:t xml:space="preserve"> de ronda</w:t>
-      </w:r>
-    </w:p>
-    <w:p>
-      <w:pPr>
-        <w:rPr>
-          <w:rFonts w:ascii="Calibri Light" w:hAnsi="Calibri Light" w:cs="Calibri Light"/>
-        </w:rPr>
-      </w:pPr>
-      <w:r>
-        <w:rPr>
-          <w:rFonts w:ascii="Calibri Light" w:hAnsi="Calibri Light" w:cs="Calibri Light"/>
-        </w:rPr>
-        <w:t xml:space="preserve">5 </w:t>
-      </w:r>
-      <w:proofErr w:type="gramStart"/>
-      <w:r>
-        <w:rPr>
-          <w:rFonts w:ascii="Calibri Light" w:hAnsi="Calibri Light" w:cs="Calibri Light"/>
-        </w:rPr>
-        <w:t>Acciones</w:t>
-      </w:r>
-      <w:proofErr w:type="gramEnd"/>
-      <w:r>
-        <w:rPr>
-          <w:rFonts w:ascii="Calibri Light" w:hAnsi="Calibri Light" w:cs="Calibri Light"/>
-        </w:rPr>
-        <w:t xml:space="preserve"> de jugador (caminar, atacar e intercambiar)</w:t>
-      </w:r>
-    </w:p>
-    <w:p>
-      <w:pPr>
-        <w:rPr>
-          <w:rFonts w:ascii="Calibri Light" w:hAnsi="Calibri Light" w:cs="Calibri Light"/>
-        </w:rPr>
-      </w:pPr>
-      <w:r>
-        <w:rPr>
-          <w:rFonts w:ascii="Calibri Light" w:hAnsi="Calibri Light" w:cs="Calibri Light"/>
-        </w:rPr>
-        <w:t>6</w:t>
-      </w:r>
-      <w:r>
-        <w:rPr>
-          <w:rFonts w:ascii="Calibri Light" w:hAnsi="Calibri Light" w:cs="Calibri Light"/>
-        </w:rPr>
-        <w:t xml:space="preserve"> </w:t>
-      </w:r>
-      <w:proofErr w:type="gramStart"/>
-      <w:r>
-        <w:rPr>
-          <w:rFonts w:ascii="Calibri Light" w:hAnsi="Calibri Light" w:cs="Calibri Light"/>
-        </w:rPr>
-        <w:t>Maleficios</w:t>
-      </w:r>
-      <w:proofErr w:type="gramEnd"/>
-      <w:r>
-        <w:rPr>
-          <w:rFonts w:ascii="Calibri Light" w:hAnsi="Calibri Light" w:cs="Calibri Light"/>
-        </w:rPr>
-        <w:t xml:space="preserve"> (</w:t>
-      </w:r>
-      <w:proofErr w:type="spellStart"/>
-      <w:r>
-        <w:rPr>
-          <w:rFonts w:ascii="Calibri Light" w:hAnsi="Calibri Light" w:cs="Calibri Light"/>
-        </w:rPr>
-        <w:t>minnions</w:t>
-      </w:r>
-      <w:proofErr w:type="spellEnd"/>
-      <w:r>
-        <w:rPr>
-          <w:rFonts w:ascii="Calibri Light" w:hAnsi="Calibri Light" w:cs="Calibri Light"/>
-        </w:rPr>
-        <w:t>, estados alterados y dirección)</w:t>
-      </w:r>
-    </w:p>
-    <w:p>
-      <w:pPr>
-        <w:rPr>
-          <w:rFonts w:ascii="Calibri Light" w:hAnsi="Calibri Light" w:cs="Calibri Light"/>
-        </w:rPr>
-      </w:pPr>
-      <w:r>
-        <w:rPr>
-          <w:rFonts w:ascii="Calibri Light" w:hAnsi="Calibri Light" w:cs="Calibri Light"/>
-        </w:rPr>
-        <w:t xml:space="preserve">7 </w:t>
-      </w:r>
-      <w:proofErr w:type="gramStart"/>
-      <w:r>
-        <w:rPr>
-          <w:rFonts w:ascii="Calibri Light" w:hAnsi="Calibri Light" w:cs="Calibri Light"/>
-        </w:rPr>
-        <w:t>Corazones</w:t>
-      </w:r>
-      <w:proofErr w:type="gramEnd"/>
-      <w:r>
-        <w:rPr>
-          <w:rFonts w:ascii="Calibri Light" w:hAnsi="Calibri Light" w:cs="Calibri Light"/>
-        </w:rPr>
-        <w:t xml:space="preserve"> y abatimientos</w:t>
+      <w:r>
+        <w:rPr>
+          <w:rFonts w:ascii="Calibri Light" w:hAnsi="Calibri Light" w:cs="Calibri Light"/>
+        </w:rPr>
+        <w:t>Maleficios (minnions, estados alterados y dirección)</w:t>
+      </w:r>
+    </w:p>
+    <w:p>
+      <w:pPr>
+        <w:rPr>
+          <w:rFonts w:ascii="Calibri Light" w:hAnsi="Calibri Light" w:cs="Calibri Light"/>
+        </w:rPr>
+      </w:pPr>
+      <w:r>
+        <w:rPr>
+          <w:rFonts w:ascii="Calibri Light" w:hAnsi="Calibri Light" w:cs="Calibri Light"/>
+        </w:rPr>
+        <w:t>7 Corazones y abatimientos</w:t>
       </w:r>
     </w:p>
     <w:p>
@@ -333,19 +219,11 @@
         </w:rPr>
         <w:t xml:space="preserve">8 </w:t>
       </w:r>
-      <w:proofErr w:type="gramStart"/>
-      <w:r>
-        <w:rPr>
-          <w:rFonts w:ascii="Calibri Light" w:hAnsi="Calibri Light" w:cs="Calibri Light"/>
-        </w:rPr>
-        <w:t>Salud</w:t>
-      </w:r>
-      <w:proofErr w:type="gramEnd"/>
-      <w:r>
-        <w:rPr>
-          <w:rFonts w:ascii="Calibri Light" w:hAnsi="Calibri Light" w:cs="Calibri Light"/>
-        </w:rPr>
-        <w:t xml:space="preserve"> de brujas (tableta, </w:t>
+      <w:r>
+        <w:rPr>
+          <w:rFonts w:ascii="Calibri Light" w:hAnsi="Calibri Light" w:cs="Calibri Light"/>
+        </w:rPr>
+        <w:t xml:space="preserve">Salud de brujas (tableta, </w:t>
       </w:r>
       <w:r>
         <w:rPr>
@@ -372,19 +250,11 @@
         </w:rPr>
         <w:t xml:space="preserve">9 </w:t>
       </w:r>
-      <w:proofErr w:type="gramStart"/>
-      <w:r>
-        <w:rPr>
-          <w:rFonts w:ascii="Calibri Light" w:hAnsi="Calibri Light" w:cs="Calibri Light"/>
-        </w:rPr>
-        <w:t>Distintas</w:t>
-      </w:r>
-      <w:proofErr w:type="gramEnd"/>
-      <w:r>
-        <w:rPr>
-          <w:rFonts w:ascii="Calibri Light" w:hAnsi="Calibri Light" w:cs="Calibri Light"/>
-        </w:rPr>
-        <w:t xml:space="preserve"> casillas (tienda, casilla de hechizo, casillas rotas casillas de bruja)</w:t>
+      <w:r>
+        <w:rPr>
+          <w:rFonts w:ascii="Calibri Light" w:hAnsi="Calibri Light" w:cs="Calibri Light"/>
+        </w:rPr>
+        <w:t>Distintas casillas (tienda, casilla de hechizo, casillas rotas casillas de bruja)</w:t>
       </w:r>
     </w:p>
     <w:p>
@@ -399,19 +269,11 @@
         </w:rPr>
         <w:t xml:space="preserve">10 </w:t>
       </w:r>
-      <w:proofErr w:type="gramStart"/>
-      <w:r>
-        <w:rPr>
-          <w:rFonts w:ascii="Calibri Light" w:hAnsi="Calibri Light" w:cs="Calibri Light"/>
-        </w:rPr>
-        <w:t>Cartas</w:t>
-      </w:r>
-      <w:proofErr w:type="gramEnd"/>
-      <w:r>
-        <w:rPr>
-          <w:rFonts w:ascii="Calibri Light" w:hAnsi="Calibri Light" w:cs="Calibri Light"/>
-        </w:rPr>
-        <w:t xml:space="preserve"> de hechizo</w:t>
+      <w:r>
+        <w:rPr>
+          <w:rFonts w:ascii="Calibri Light" w:hAnsi="Calibri Light" w:cs="Calibri Light"/>
+        </w:rPr>
+        <w:t>Cartas de hechizo</w:t>
       </w:r>
     </w:p>
     <w:p>
@@ -426,14 +288,12 @@
         </w:rPr>
         <w:t xml:space="preserve">11 </w:t>
       </w:r>
-      <w:proofErr w:type="spellStart"/>
       <w:r>
         <w:rPr>
           <w:rFonts w:ascii="Calibri Light" w:hAnsi="Calibri Light" w:cs="Calibri Light"/>
         </w:rPr>
         <w:t>Charms</w:t>
       </w:r>
-      <w:proofErr w:type="spellEnd"/>
     </w:p>
     <w:p>
       <w:pPr>
@@ -466,19 +326,11 @@
         </w:rPr>
         <w:t xml:space="preserve">13 </w:t>
       </w:r>
-      <w:proofErr w:type="gramStart"/>
-      <w:r>
-        <w:rPr>
-          <w:rFonts w:ascii="Calibri Light" w:hAnsi="Calibri Light" w:cs="Calibri Light"/>
-        </w:rPr>
-        <w:t>Primera</w:t>
-      </w:r>
-      <w:proofErr w:type="gramEnd"/>
-      <w:r>
-        <w:rPr>
-          <w:rFonts w:ascii="Calibri Light" w:hAnsi="Calibri Light" w:cs="Calibri Light"/>
-        </w:rPr>
-        <w:t xml:space="preserve"> partida guiada (?)</w:t>
+      <w:r>
+        <w:rPr>
+          <w:rFonts w:ascii="Calibri Light" w:hAnsi="Calibri Light" w:cs="Calibri Light"/>
+        </w:rPr>
+        <w:t>Primera partida guiada (?)</w:t>
       </w:r>
     </w:p>
     <w:p>
@@ -493,33 +345,11 @@
         </w:rPr>
         <w:t xml:space="preserve">14 </w:t>
       </w:r>
-      <w:proofErr w:type="gramStart"/>
-      <w:r>
-        <w:rPr>
-          <w:rFonts w:ascii="Calibri Light" w:hAnsi="Calibri Light" w:cs="Calibri Light"/>
-        </w:rPr>
-        <w:t>Glosario</w:t>
-      </w:r>
-      <w:proofErr w:type="gramEnd"/>
-      <w:r>
-        <w:rPr>
-          <w:rFonts w:ascii="Calibri Light" w:hAnsi="Calibri Light" w:cs="Calibri Light"/>
-        </w:rPr>
-        <w:t xml:space="preserve"> (es casi obligatorio, hay que explicar agarrar, invocar, imitar, </w:t>
-      </w:r>
-      <w:proofErr w:type="spellStart"/>
-      <w:r>
-        <w:rPr>
-          <w:rFonts w:ascii="Calibri Light" w:hAnsi="Calibri Light" w:cs="Calibri Light"/>
-        </w:rPr>
-        <w:t>etc</w:t>
-      </w:r>
-      <w:proofErr w:type="spellEnd"/>
-      <w:r>
-        <w:rPr>
-          <w:rFonts w:ascii="Calibri Light" w:hAnsi="Calibri Light" w:cs="Calibri Light"/>
-        </w:rPr>
-        <w:t>)</w:t>
+      <w:r>
+        <w:rPr>
+          <w:rFonts w:ascii="Calibri Light" w:hAnsi="Calibri Light" w:cs="Calibri Light"/>
+        </w:rPr>
+        <w:t>Glosario (es casi obligatorio, hay que explicar agarrar, invocar, imitar, etc)</w:t>
       </w:r>
     </w:p>
     <w:p>
@@ -534,19 +364,11 @@
         </w:rPr>
         <w:t xml:space="preserve">15 </w:t>
       </w:r>
-      <w:proofErr w:type="gramStart"/>
-      <w:r>
-        <w:rPr>
-          <w:rFonts w:ascii="Calibri Light" w:hAnsi="Calibri Light" w:cs="Calibri Light"/>
-        </w:rPr>
-        <w:t>Interacciones</w:t>
-      </w:r>
-      <w:proofErr w:type="gramEnd"/>
-      <w:r>
-        <w:rPr>
-          <w:rFonts w:ascii="Calibri Light" w:hAnsi="Calibri Light" w:cs="Calibri Light"/>
-        </w:rPr>
-        <w:t xml:space="preserve"> especiales</w:t>
+      <w:r>
+        <w:rPr>
+          <w:rFonts w:ascii="Calibri Light" w:hAnsi="Calibri Light" w:cs="Calibri Light"/>
+        </w:rPr>
+        <w:t>Interacciones especiales</w:t>
       </w:r>
     </w:p>
     <w:p>
@@ -565,7 +387,6 @@
         </w:rPr>
         <w:t xml:space="preserve">16 </w:t>
       </w:r>
-      <w:proofErr w:type="spellStart"/>
       <w:r>
         <w:rPr>
           <w:rFonts w:ascii="Calibri Light" w:hAnsi="Calibri Light" w:cs="Calibri Light"/>
@@ -574,7 +395,6 @@
         </w:rPr>
         <w:t>Pototo</w:t>
       </w:r>
-      <w:proofErr w:type="spellEnd"/>
     </w:p>
     <w:p>
       <w:pPr>
@@ -607,7 +427,6 @@
           <w:rFonts w:ascii="Calibri Light" w:hAnsi="Calibri Light" w:cs="Calibri Light"/>
         </w:rPr>
       </w:pPr>
-      <w:proofErr w:type="spellStart"/>
       <w:r>
         <w:rPr>
           <w:rFonts w:ascii="Calibri Light" w:hAnsi="Calibri Light" w:cs="Calibri Light"/>
@@ -615,7 +434,6 @@
         <w:lastRenderedPageBreak/>
         <w:t>Introduccion</w:t>
       </w:r>
-      <w:proofErr w:type="spellEnd"/>
     </w:p>
     <w:p>
       <w:pPr>
@@ -635,89 +453,27 @@
           <w:rStyle w:val="aclaracaoChar"/>
           <w:rFonts w:ascii="Calibri Light" w:hAnsi="Calibri Light" w:cs="Calibri Light"/>
         </w:rPr>
-        <w:t xml:space="preserve">(sin </w:t>
-      </w:r>
-      <w:proofErr w:type="spellStart"/>
-      <w:r>
-        <w:rPr>
-          <w:rStyle w:val="aclaracaoChar"/>
-          <w:rFonts w:ascii="Calibri Light" w:hAnsi="Calibri Light" w:cs="Calibri Light"/>
-        </w:rPr>
-        <w:t>titulo</w:t>
-      </w:r>
-      <w:proofErr w:type="spellEnd"/>
-      <w:r>
-        <w:rPr>
-          <w:rStyle w:val="aclaracaoChar"/>
-          <w:rFonts w:ascii="Calibri Light" w:hAnsi="Calibri Light" w:cs="Calibri Light"/>
-        </w:rPr>
-        <w:t xml:space="preserve"> en la maquetación, como </w:t>
-      </w:r>
-      <w:proofErr w:type="spellStart"/>
-      <w:r>
-        <w:rPr>
-          <w:rStyle w:val="aclaracaoChar"/>
-          <w:rFonts w:ascii="Calibri Light" w:hAnsi="Calibri Light" w:cs="Calibri Light"/>
-        </w:rPr>
-        <w:t>mysterium</w:t>
-      </w:r>
-      <w:proofErr w:type="spellEnd"/>
-      <w:r>
-        <w:rPr>
-          <w:rStyle w:val="aclaracaoChar"/>
-          <w:rFonts w:ascii="Calibri Light" w:hAnsi="Calibri Light" w:cs="Calibri Light"/>
-        </w:rPr>
-        <w:t>)</w:t>
-      </w:r>
-    </w:p>
-    <w:p>
-      <w:pPr>
-        <w:rPr>
-          <w:rFonts w:ascii="Calibri Light" w:hAnsi="Calibri Light" w:cs="Calibri Light"/>
-        </w:rPr>
-      </w:pPr>
-      <w:r>
-        <w:rPr>
-          <w:rFonts w:ascii="Calibri Light" w:hAnsi="Calibri Light" w:cs="Calibri Light"/>
-        </w:rPr>
-        <w:t xml:space="preserve">Desde hace más de veinte siglos y trece generaciones de Brujas Supremas existe el </w:t>
-      </w:r>
-      <w:proofErr w:type="spellStart"/>
-      <w:r>
-        <w:rPr>
-          <w:rFonts w:ascii="Calibri Light" w:hAnsi="Calibri Light" w:cs="Calibri Light"/>
-        </w:rPr>
-        <w:t>Hex</w:t>
-      </w:r>
-      <w:proofErr w:type="spellEnd"/>
-      <w:r>
-        <w:rPr>
-          <w:rFonts w:ascii="Calibri Light" w:hAnsi="Calibri Light" w:cs="Calibri Light"/>
-        </w:rPr>
-        <w:t xml:space="preserve">. Un aquelarre donde el poder sólo se transmite acabando con la generación anterior. </w:t>
+        <w:t>(sin titulo en la maquetación, como mysterium)</w:t>
+      </w:r>
+    </w:p>
+    <w:p>
+      <w:pPr>
+        <w:rPr>
+          <w:rFonts w:ascii="Calibri Light" w:hAnsi="Calibri Light" w:cs="Calibri Light"/>
+        </w:rPr>
+      </w:pPr>
+      <w:r>
+        <w:rPr>
+          <w:rFonts w:ascii="Calibri Light" w:hAnsi="Calibri Light" w:cs="Calibri Light"/>
+        </w:rPr>
+        <w:t xml:space="preserve">Desde hace más de veinte siglos y trece generaciones de Brujas Supremas existe el Hex. Un aquelarre donde el poder sólo se transmite acabando con la generación anterior. </w:t>
       </w:r>
       <w:r>
         <w:rPr>
           <w:rStyle w:val="aclaraaoChar"/>
           <w:rFonts w:ascii="Calibri Light" w:hAnsi="Calibri Light" w:cs="Calibri Light"/>
         </w:rPr>
-        <w:t xml:space="preserve">(esto personalmente me parece un poco explicado en la cara de </w:t>
-      </w:r>
-      <w:proofErr w:type="spellStart"/>
-      <w:r>
-        <w:rPr>
-          <w:rStyle w:val="aclaraaoChar"/>
-          <w:rFonts w:ascii="Calibri Light" w:hAnsi="Calibri Light" w:cs="Calibri Light"/>
-        </w:rPr>
-        <w:t>mas</w:t>
-      </w:r>
-      <w:proofErr w:type="spellEnd"/>
-      <w:r>
-        <w:rPr>
-          <w:rStyle w:val="aclaraaoChar"/>
-          <w:rFonts w:ascii="Calibri Light" w:hAnsi="Calibri Light" w:cs="Calibri Light"/>
-        </w:rPr>
-        <w:t>)</w:t>
+        <w:t>(esto personalmente me parece un poco explicado en la cara de mas)</w:t>
       </w:r>
       <w:r>
         <w:rPr>
@@ -835,21 +591,7 @@
         <w:rPr>
           <w:rFonts w:ascii="Calibri Light" w:hAnsi="Calibri Light" w:cs="Calibri Light"/>
         </w:rPr>
-        <w:t>Para ganar una partida de “</w:t>
-      </w:r>
-      <w:proofErr w:type="spellStart"/>
-      <w:r>
-        <w:rPr>
-          <w:rFonts w:ascii="Calibri Light" w:hAnsi="Calibri Light" w:cs="Calibri Light"/>
-        </w:rPr>
-        <w:t>Hex</w:t>
-      </w:r>
-      <w:proofErr w:type="spellEnd"/>
-      <w:r>
-        <w:rPr>
-          <w:rFonts w:ascii="Calibri Light" w:hAnsi="Calibri Light" w:cs="Calibri Light"/>
-        </w:rPr>
-        <w:t>, el Aquelarre”, los novicios (o jugadores) deben derrotar a todas las brujas supremas de la partida. </w:t>
+        <w:t>Para ganar una partida de “Hex, el Aquelarre”, los novicios (o jugadores) deben derrotar a todas las brujas supremas de la partida. </w:t>
       </w:r>
     </w:p>
     <w:p>
@@ -971,21 +713,7 @@
         <w:rPr>
           <w:rFonts w:ascii="Calibri Light" w:hAnsi="Calibri Light" w:cs="Calibri Light"/>
         </w:rPr>
-        <w:t xml:space="preserve"> al </w:t>
-      </w:r>
-      <w:proofErr w:type="spellStart"/>
-      <w:r>
-        <w:rPr>
-          <w:rFonts w:ascii="Calibri Light" w:hAnsi="Calibri Light" w:cs="Calibri Light"/>
-        </w:rPr>
-        <w:t>Hex</w:t>
-      </w:r>
-      <w:proofErr w:type="spellEnd"/>
-      <w:r>
-        <w:rPr>
-          <w:rFonts w:ascii="Calibri Light" w:hAnsi="Calibri Light" w:cs="Calibri Light"/>
-        </w:rPr>
-        <w:t>.</w:t>
+        <w:t xml:space="preserve"> al Hex.</w:t>
       </w:r>
     </w:p>
     <w:p>
@@ -999,16 +727,8 @@
         <w:rPr>
           <w:rFonts w:ascii="Calibri Light" w:hAnsi="Calibri Light" w:cs="Calibri Light"/>
         </w:rPr>
-        <w:t xml:space="preserve">Maybe es un poco corto. </w:t>
-      </w:r>
-      <w:proofErr w:type="gramStart"/>
-      <w:r>
-        <w:rPr>
-          <w:rFonts w:ascii="Calibri Light" w:hAnsi="Calibri Light" w:cs="Calibri Light"/>
-        </w:rPr>
-        <w:t>Poner un párrafo más?</w:t>
-      </w:r>
-      <w:proofErr w:type="gramEnd"/>
+        <w:t>Maybe es un poco corto. Poner un párrafo más?</w:t>
+      </w:r>
     </w:p>
     <w:p>
       <w:pPr>
@@ -1057,29 +777,13 @@
           <w:rFonts w:ascii="Calibri Light" w:hAnsi="Calibri Light" w:cs="Calibri Light"/>
         </w:rPr>
       </w:pPr>
-      <w:proofErr w:type="spellStart"/>
       <w:r>
         <w:rPr>
           <w:rFonts w:ascii="Calibri Light" w:hAnsi="Calibri Light" w:cs="Calibri Light"/>
         </w:rPr>
         <w:lastRenderedPageBreak/>
-        <w:t>Component</w:t>
-      </w:r>
-      <w:proofErr w:type="spellEnd"/>
-      <w:r>
-        <w:rPr>
-          <w:rFonts w:ascii="Calibri Light" w:hAnsi="Calibri Light" w:cs="Calibri Light"/>
-        </w:rPr>
-        <w:t xml:space="preserve"> </w:t>
-      </w:r>
-      <w:proofErr w:type="spellStart"/>
-      <w:r>
-        <w:rPr>
-          <w:rFonts w:ascii="Calibri Light" w:hAnsi="Calibri Light" w:cs="Calibri Light"/>
-        </w:rPr>
-        <w:t>list</w:t>
-      </w:r>
-      <w:proofErr w:type="spellEnd"/>
+        <w:t>Component list</w:t>
+      </w:r>
     </w:p>
     <w:p>
       <w:pPr>
@@ -1157,7 +861,13 @@
               <w:rPr>
                 <w:rFonts w:ascii="Calibri Light" w:hAnsi="Calibri Light" w:cs="Calibri Light"/>
               </w:rPr>
-              <w:t>Cartas de armas</w:t>
+              <w:t xml:space="preserve">Cartas de </w:t>
+            </w:r>
+            <w:r>
+              <w:rPr>
+                <w:rFonts w:ascii="Calibri Light" w:hAnsi="Calibri Light" w:cs="Calibri Light"/>
+              </w:rPr>
+              <w:t>hechizos</w:t>
             </w:r>
           </w:p>
         </w:tc>
@@ -1618,14 +1328,12 @@
                 <w:rFonts w:ascii="Calibri Light" w:hAnsi="Calibri Light" w:cs="Calibri Light"/>
               </w:rPr>
             </w:pPr>
-            <w:proofErr w:type="spellStart"/>
             <w:r>
               <w:rPr>
                 <w:rFonts w:ascii="Calibri Light" w:hAnsi="Calibri Light" w:cs="Calibri Light"/>
               </w:rPr>
               <w:t>Minnions</w:t>
             </w:r>
-            <w:proofErr w:type="spellEnd"/>
           </w:p>
         </w:tc>
         <w:tc>
@@ -1770,35 +1478,7 @@
               <w:rPr>
                 <w:rFonts w:ascii="Calibri Light" w:hAnsi="Calibri Light" w:cs="Calibri Light"/>
               </w:rPr>
-              <w:t>(</w:t>
-            </w:r>
-            <w:proofErr w:type="spellStart"/>
-            <w:r>
-              <w:rPr>
-                <w:rFonts w:ascii="Calibri Light" w:hAnsi="Calibri Light" w:cs="Calibri Light"/>
-              </w:rPr>
-              <w:t>zex</w:t>
-            </w:r>
-            <w:proofErr w:type="spellEnd"/>
-            <w:r>
-              <w:rPr>
-                <w:rFonts w:ascii="Calibri Light" w:hAnsi="Calibri Light" w:cs="Calibri Light"/>
-              </w:rPr>
-              <w:t xml:space="preserve"> y </w:t>
-            </w:r>
-            <w:proofErr w:type="spellStart"/>
-            <w:r>
-              <w:rPr>
-                <w:rFonts w:ascii="Calibri Light" w:hAnsi="Calibri Light" w:cs="Calibri Light"/>
-              </w:rPr>
-              <w:t>xar</w:t>
-            </w:r>
-            <w:proofErr w:type="spellEnd"/>
-            <w:r>
-              <w:rPr>
-                <w:rFonts w:ascii="Calibri Light" w:hAnsi="Calibri Light" w:cs="Calibri Light"/>
-              </w:rPr>
-              <w:t>)</w:t>
+              <w:t>(zex y xar)</w:t>
             </w:r>
           </w:p>
         </w:tc>
@@ -1813,6 +1493,196 @@
     </w:p>
     <w:p>
       <w:pPr>
+        <w:rPr>
+          <w:rFonts w:ascii="Calibri Light" w:hAnsi="Calibri Light" w:cs="Calibri Light"/>
+        </w:rPr>
+      </w:pPr>
+      <w:r>
+        <w:rPr>
+          <w:rFonts w:ascii="Calibri Light" w:hAnsi="Calibri Light" w:cs="Calibri Light"/>
+        </w:rPr>
+        <w:t xml:space="preserve">Dos bolsas transparentes para cartas: </w:t>
+      </w:r>
+    </w:p>
+    <w:p>
+      <w:pPr>
+        <w:pStyle w:val="ListParagraph"/>
+        <w:numPr>
+          <w:ilvl w:val="0"/>
+          <w:numId w:val="15"/>
+        </w:numPr>
+        <w:rPr>
+          <w:rFonts w:ascii="Calibri Light" w:hAnsi="Calibri Light" w:cs="Calibri Light"/>
+        </w:rPr>
+      </w:pPr>
+      <w:r>
+        <w:rPr>
+          <w:rFonts w:ascii="Calibri Light" w:hAnsi="Calibri Light" w:cs="Calibri Light"/>
+        </w:rPr>
+        <w:t>Mazo maleficios (50)</w:t>
+      </w:r>
+    </w:p>
+    <w:p>
+      <w:pPr>
+        <w:pStyle w:val="ListParagraph"/>
+        <w:numPr>
+          <w:ilvl w:val="0"/>
+          <w:numId w:val="15"/>
+        </w:numPr>
+        <w:rPr>
+          <w:rFonts w:ascii="Calibri Light" w:hAnsi="Calibri Light" w:cs="Calibri Light"/>
+        </w:rPr>
+      </w:pPr>
+      <w:r>
+        <w:rPr>
+          <w:rFonts w:ascii="Calibri Light" w:hAnsi="Calibri Light" w:cs="Calibri Light"/>
+        </w:rPr>
+        <w:t xml:space="preserve">Mazo hechizos y </w:t>
+      </w:r>
+      <w:proofErr w:type="spellStart"/>
+      <w:r>
+        <w:rPr>
+          <w:rFonts w:ascii="Calibri Light" w:hAnsi="Calibri Light" w:cs="Calibri Light"/>
+        </w:rPr>
+        <w:t>charms</w:t>
+      </w:r>
+      <w:proofErr w:type="spellEnd"/>
+      <w:r>
+        <w:rPr>
+          <w:rFonts w:ascii="Calibri Light" w:hAnsi="Calibri Light" w:cs="Calibri Light"/>
+        </w:rPr>
+        <w:t xml:space="preserve"> (50)</w:t>
+      </w:r>
+    </w:p>
+    <w:p>
+      <w:pPr>
+        <w:pStyle w:val="ListParagraph"/>
+        <w:numPr>
+          <w:ilvl w:val="0"/>
+          <w:numId w:val="15"/>
+        </w:numPr>
+        <w:rPr>
+          <w:rFonts w:ascii="Calibri Light" w:hAnsi="Calibri Light" w:cs="Calibri Light"/>
+        </w:rPr>
+      </w:pPr>
+      <w:r>
+        <w:rPr>
+          <w:rFonts w:ascii="Calibri Light" w:hAnsi="Calibri Light" w:cs="Calibri Light"/>
+        </w:rPr>
+        <w:t>Bolsita pequeña para fichas estado</w:t>
+      </w:r>
+      <w:r>
+        <w:rPr>
+          <w:rFonts w:ascii="Calibri Light" w:hAnsi="Calibri Light" w:cs="Calibri Light"/>
+        </w:rPr>
+        <w:t xml:space="preserve"> + dos fichas de protección de señuelo</w:t>
+      </w:r>
+    </w:p>
+    <w:p>
+      <w:pPr>
+        <w:pStyle w:val="ListParagraph"/>
+        <w:numPr>
+          <w:ilvl w:val="0"/>
+          <w:numId w:val="15"/>
+        </w:numPr>
+        <w:rPr>
+          <w:rFonts w:ascii="Calibri Light" w:hAnsi="Calibri Light" w:cs="Calibri Light"/>
+        </w:rPr>
+      </w:pPr>
+      <w:r>
+        <w:rPr>
+          <w:rFonts w:ascii="Calibri Light" w:hAnsi="Calibri Light" w:cs="Calibri Light"/>
+        </w:rPr>
+        <w:t xml:space="preserve">Bolsita para fichas jugador </w:t>
+      </w:r>
+      <w:r>
+        <w:rPr>
+          <w:rFonts w:ascii="Calibri Light" w:hAnsi="Calibri Light" w:cs="Calibri Light"/>
+        </w:rPr>
+        <w:tab/>
+      </w:r>
+    </w:p>
+    <w:p>
+      <w:pPr>
+        <w:pStyle w:val="ListParagraph"/>
+        <w:numPr>
+          <w:ilvl w:val="0"/>
+          <w:numId w:val="15"/>
+        </w:numPr>
+        <w:rPr>
+          <w:rFonts w:ascii="Calibri Light" w:hAnsi="Calibri Light" w:cs="Calibri Light"/>
+        </w:rPr>
+      </w:pPr>
+      <w:r>
+        <w:rPr>
+          <w:rFonts w:ascii="Calibri Light" w:hAnsi="Calibri Light" w:cs="Calibri Light"/>
+        </w:rPr>
+        <w:t>Bolsita para monedas</w:t>
+      </w:r>
+      <w:r>
+        <w:rPr>
+          <w:rFonts w:ascii="Calibri Light" w:hAnsi="Calibri Light" w:cs="Calibri Light"/>
+        </w:rPr>
+        <w:t xml:space="preserve"> y vidas de bruja</w:t>
+      </w:r>
+    </w:p>
+    <w:p>
+      <w:pPr>
+        <w:pStyle w:val="ListParagraph"/>
+        <w:numPr>
+          <w:ilvl w:val="0"/>
+          <w:numId w:val="15"/>
+        </w:numPr>
+        <w:rPr>
+          <w:rFonts w:ascii="Calibri Light" w:hAnsi="Calibri Light" w:cs="Calibri Light"/>
+        </w:rPr>
+      </w:pPr>
+      <w:r>
+        <w:rPr>
+          <w:rFonts w:ascii="Calibri Light" w:hAnsi="Calibri Light" w:cs="Calibri Light"/>
+        </w:rPr>
+        <w:t xml:space="preserve">Bolsita para </w:t>
+      </w:r>
+      <w:proofErr w:type="spellStart"/>
+      <w:r>
+        <w:rPr>
+          <w:rFonts w:ascii="Calibri Light" w:hAnsi="Calibri Light" w:cs="Calibri Light"/>
+        </w:rPr>
+        <w:t>minnions</w:t>
+      </w:r>
+      <w:proofErr w:type="spellEnd"/>
+    </w:p>
+    <w:p>
+      <w:pPr>
+        <w:pStyle w:val="ListParagraph"/>
+        <w:numPr>
+          <w:ilvl w:val="0"/>
+          <w:numId w:val="15"/>
+        </w:numPr>
+        <w:rPr>
+          <w:rFonts w:ascii="Calibri Light" w:hAnsi="Calibri Light" w:cs="Calibri Light"/>
+        </w:rPr>
+      </w:pPr>
+      <w:r>
+        <w:rPr>
+          <w:rFonts w:ascii="Calibri Light" w:hAnsi="Calibri Light" w:cs="Calibri Light"/>
+        </w:rPr>
+        <w:t>Bolsita para corazones</w:t>
+      </w:r>
+      <w:r>
+        <w:rPr>
+          <w:rFonts w:ascii="Calibri Light" w:hAnsi="Calibri Light" w:cs="Calibri Light"/>
+        </w:rPr>
+        <w:t xml:space="preserve"> de jugadores</w:t>
+      </w:r>
+    </w:p>
+    <w:p>
+      <w:pPr>
+        <w:pStyle w:val="ListParagraph"/>
+        <w:numPr>
+          <w:ilvl w:val="0"/>
+          <w:numId w:val="15"/>
+        </w:numPr>
         <w:rPr>
           <w:rFonts w:ascii="Calibri Light" w:hAnsi="Calibri Light" w:cs="Calibri Light"/>
         </w:rPr>
@@ -2449,13 +2319,17 @@
               <w:jc w:val="center"/>
               <w:rPr>
                 <w:rFonts w:ascii="Calibri Light" w:hAnsi="Calibri Light" w:cs="Calibri Light"/>
-              </w:rPr>
-            </w:pPr>
-            <w:r>
-              <w:rPr>
-                <w:rFonts w:ascii="Calibri Light" w:hAnsi="Calibri Light" w:cs="Calibri Light"/>
-              </w:rPr>
-              <w:t>Principiante</w:t>
+                <w:color w:val="EE0000"/>
+                <w:highlight w:val="yellow"/>
+              </w:rPr>
+            </w:pPr>
+            <w:r>
+              <w:rPr>
+                <w:rFonts w:ascii="Calibri Light" w:hAnsi="Calibri Light" w:cs="Calibri Light"/>
+                <w:color w:val="EE0000"/>
+                <w:highlight w:val="yellow"/>
+              </w:rPr>
+              <w:t>Pacífico</w:t>
             </w:r>
           </w:p>
         </w:tc>
@@ -2469,11 +2343,15 @@
               <w:jc w:val="center"/>
               <w:rPr>
                 <w:rFonts w:ascii="Calibri Light" w:hAnsi="Calibri Light" w:cs="Calibri Light"/>
-              </w:rPr>
-            </w:pPr>
-            <w:r>
-              <w:rPr>
-                <w:rFonts w:ascii="Calibri Light" w:hAnsi="Calibri Light" w:cs="Calibri Light"/>
+                <w:color w:val="EE0000"/>
+                <w:highlight w:val="yellow"/>
+              </w:rPr>
+            </w:pPr>
+            <w:r>
+              <w:rPr>
+                <w:rFonts w:ascii="Calibri Light" w:hAnsi="Calibri Light" w:cs="Calibri Light"/>
+                <w:color w:val="EE0000"/>
+                <w:highlight w:val="yellow"/>
               </w:rPr>
               <w:t>-1</w:t>
             </w:r>
@@ -2486,16 +2364,33 @@
           </w:tcPr>
           <w:p>
             <w:pPr>
+              <w:pBdr>
+                <w:bottom w:val="single" w:sz="6" w:space="1" w:color="auto"/>
+              </w:pBdr>
               <w:jc w:val="center"/>
               <w:rPr>
                 <w:rFonts w:ascii="Calibri Light" w:hAnsi="Calibri Light" w:cs="Calibri Light"/>
-              </w:rPr>
-            </w:pPr>
-            <w:r>
-              <w:rPr>
-                <w:rFonts w:ascii="Calibri Light" w:hAnsi="Calibri Light" w:cs="Calibri Light"/>
-              </w:rPr>
-              <w:t>---</w:t>
+                <w:color w:val="EE0000"/>
+                <w:highlight w:val="yellow"/>
+              </w:rPr>
+            </w:pPr>
+          </w:p>
+          <w:p>
+            <w:pPr>
+              <w:jc w:val="center"/>
+              <w:rPr>
+                <w:rFonts w:ascii="Calibri Light" w:hAnsi="Calibri Light" w:cs="Calibri Light"/>
+                <w:color w:val="EE0000"/>
+                <w:highlight w:val="yellow"/>
+              </w:rPr>
+            </w:pPr>
+            <w:r>
+              <w:rPr>
+                <w:rFonts w:ascii="Calibri Light" w:hAnsi="Calibri Light" w:cs="Calibri Light"/>
+                <w:color w:val="EE0000"/>
+                <w:highlight w:val="yellow"/>
+              </w:rPr>
+              <w:t>I DONT THINK PRINCIPIANTE SHOULD EXIST…</w:t>
             </w:r>
           </w:p>
         </w:tc>
@@ -2607,16 +2502,8 @@
         <w:rPr>
           <w:rFonts w:ascii="Calibri Light" w:hAnsi="Calibri Light" w:cs="Calibri Light"/>
         </w:rPr>
-        <w:t xml:space="preserve">Pensar en la fumada de </w:t>
-      </w:r>
-      <w:proofErr w:type="spellStart"/>
-      <w:r>
-        <w:rPr>
-          <w:rFonts w:ascii="Calibri Light" w:hAnsi="Calibri Light" w:cs="Calibri Light"/>
-        </w:rPr>
-        <w:t>álvaro</w:t>
-      </w:r>
-      <w:proofErr w:type="spellEnd"/>
+        <w:t>Pensar en la fumada de álvaro</w:t>
+      </w:r>
     </w:p>
     <w:p>
       <w:pPr>
@@ -2714,111 +2601,45 @@
           <w:i/>
           <w:iCs/>
         </w:rPr>
-        <w:t xml:space="preserve">un tablero </w:t>
-      </w:r>
-      <w:proofErr w:type="spellStart"/>
-      <w:r>
-        <w:rPr>
+        <w:t xml:space="preserve">un tablero prehecho </w:t>
+      </w:r>
+      <w:r>
+        <w:rPr>
+          <w:rStyle w:val="enlaseChar"/>
           <w:rFonts w:ascii="Calibri Light" w:hAnsi="Calibri Light" w:cs="Calibri Light"/>
           <w:i/>
           <w:iCs/>
         </w:rPr>
-        <w:t>prehecho</w:t>
-      </w:r>
-      <w:proofErr w:type="spellEnd"/>
+        <w:t>en el capítulo X</w:t>
+      </w:r>
       <w:r>
         <w:rPr>
           <w:rFonts w:ascii="Calibri Light" w:hAnsi="Calibri Light" w:cs="Calibri Light"/>
           <w:i/>
           <w:iCs/>
         </w:rPr>
-        <w:t xml:space="preserve"> </w:t>
+        <w:t xml:space="preserve"> )</w:t>
+      </w:r>
+    </w:p>
+    <w:p>
+      <w:pPr>
+        <w:rPr>
+          <w:rFonts w:ascii="Calibri Light" w:hAnsi="Calibri Light" w:cs="Calibri Light"/>
+        </w:rPr>
+      </w:pPr>
+      <w:r>
+        <w:rPr>
+          <w:rFonts w:ascii="Calibri Light" w:hAnsi="Calibri Light" w:cs="Calibri Light"/>
+        </w:rPr>
+        <w:t xml:space="preserve">Escoged las brujas enemigas (el numero de brujas depende del numero de jugadores y dificultad elegida. </w:t>
       </w:r>
       <w:r>
         <w:rPr>
           <w:rStyle w:val="enlaseChar"/>
           <w:rFonts w:ascii="Calibri Light" w:hAnsi="Calibri Light" w:cs="Calibri Light"/>
-          <w:i/>
-          <w:iCs/>
-        </w:rPr>
-        <w:t xml:space="preserve">en el capítulo </w:t>
-      </w:r>
-      <w:proofErr w:type="gramStart"/>
-      <w:r>
-        <w:rPr>
-          <w:rStyle w:val="enlaseChar"/>
-          <w:rFonts w:ascii="Calibri Light" w:hAnsi="Calibri Light" w:cs="Calibri Light"/>
-          <w:i/>
-          <w:iCs/>
-        </w:rPr>
-        <w:t>X</w:t>
-      </w:r>
-      <w:r>
-        <w:rPr>
-          <w:rFonts w:ascii="Calibri Light" w:hAnsi="Calibri Light" w:cs="Calibri Light"/>
-          <w:i/>
-          <w:iCs/>
-        </w:rPr>
-        <w:t xml:space="preserve"> )</w:t>
-      </w:r>
-      <w:proofErr w:type="gramEnd"/>
-    </w:p>
-    <w:p>
-      <w:pPr>
-        <w:rPr>
-          <w:rFonts w:ascii="Calibri Light" w:hAnsi="Calibri Light" w:cs="Calibri Light"/>
-        </w:rPr>
-      </w:pPr>
-      <w:r>
-        <w:rPr>
-          <w:rFonts w:ascii="Calibri Light" w:hAnsi="Calibri Light" w:cs="Calibri Light"/>
-        </w:rPr>
-        <w:t xml:space="preserve">Escoged las brujas enemigas (el </w:t>
-      </w:r>
-      <w:proofErr w:type="spellStart"/>
-      <w:r>
-        <w:rPr>
-          <w:rFonts w:ascii="Calibri Light" w:hAnsi="Calibri Light" w:cs="Calibri Light"/>
-        </w:rPr>
-        <w:t>numero</w:t>
-      </w:r>
-      <w:proofErr w:type="spellEnd"/>
-      <w:r>
-        <w:rPr>
-          <w:rFonts w:ascii="Calibri Light" w:hAnsi="Calibri Light" w:cs="Calibri Light"/>
-        </w:rPr>
-        <w:t xml:space="preserve"> de brujas depende del </w:t>
-      </w:r>
-      <w:proofErr w:type="spellStart"/>
-      <w:r>
-        <w:rPr>
-          <w:rFonts w:ascii="Calibri Light" w:hAnsi="Calibri Light" w:cs="Calibri Light"/>
-        </w:rPr>
-        <w:t>numero</w:t>
-      </w:r>
-      <w:proofErr w:type="spellEnd"/>
-      <w:r>
-        <w:rPr>
-          <w:rFonts w:ascii="Calibri Light" w:hAnsi="Calibri Light" w:cs="Calibri Light"/>
-        </w:rPr>
-        <w:t xml:space="preserve"> de jugadores y dificultad elegida. </w:t>
-      </w:r>
-      <w:r>
-        <w:rPr>
-          <w:rStyle w:val="enlaseChar"/>
-          <w:rFonts w:ascii="Calibri Light" w:hAnsi="Calibri Light" w:cs="Calibri Light"/>
-        </w:rPr>
-        <w:t xml:space="preserve">Ver enlace a ese </w:t>
-      </w:r>
-      <w:proofErr w:type="spellStart"/>
-      <w:r>
-        <w:rPr>
-          <w:rStyle w:val="enlaseChar"/>
-          <w:rFonts w:ascii="Calibri Light" w:hAnsi="Calibri Light" w:cs="Calibri Light"/>
-        </w:rPr>
-        <w:t>capitulo</w:t>
-      </w:r>
-      <w:proofErr w:type="spellEnd"/>
+        </w:rPr>
+        <w:t>Ver enlace a ese capitulo</w:t>
+      </w:r>
       <w:r>
         <w:rPr>
           <w:rFonts w:ascii="Calibri Light" w:hAnsi="Calibri Light" w:cs="Calibri Light"/>
@@ -3119,35 +2940,7 @@
         <w:rPr>
           <w:rFonts w:ascii="Calibri Light" w:hAnsi="Calibri Light" w:cs="Calibri Light"/>
         </w:rPr>
-        <w:t xml:space="preserve">(ilustración donde el jugador se mueve a una casilla y en la segunda </w:t>
-      </w:r>
-      <w:proofErr w:type="spellStart"/>
-      <w:r>
-        <w:rPr>
-          <w:rFonts w:ascii="Calibri Light" w:hAnsi="Calibri Light" w:cs="Calibri Light"/>
-        </w:rPr>
-        <w:t>accion</w:t>
-      </w:r>
-      <w:proofErr w:type="spellEnd"/>
-      <w:r>
-        <w:rPr>
-          <w:rFonts w:ascii="Calibri Light" w:hAnsi="Calibri Light" w:cs="Calibri Light"/>
-        </w:rPr>
-        <w:t xml:space="preserve"> puede </w:t>
-      </w:r>
-      <w:proofErr w:type="spellStart"/>
-      <w:r>
-        <w:rPr>
-          <w:rFonts w:ascii="Calibri Light" w:hAnsi="Calibri Light" w:cs="Calibri Light"/>
-        </w:rPr>
-        <w:t>either</w:t>
-      </w:r>
-      <w:proofErr w:type="spellEnd"/>
-      <w:r>
-        <w:rPr>
-          <w:rFonts w:ascii="Calibri Light" w:hAnsi="Calibri Light" w:cs="Calibri Light"/>
-        </w:rPr>
-        <w:t xml:space="preserve"> volverse a mover o atacar)</w:t>
+        <w:t>(ilustración donde el jugador se mueve a una casilla y en la segunda accion puede either volverse a mover o atacar)</w:t>
       </w:r>
     </w:p>
     <w:p>
@@ -3545,14 +3338,12 @@
           <w:rFonts w:ascii="Calibri Light" w:hAnsi="Calibri Light" w:cs="Calibri Light"/>
         </w:rPr>
       </w:pPr>
-      <w:proofErr w:type="spellStart"/>
       <w:r>
         <w:rPr>
           <w:rFonts w:ascii="Calibri Light" w:hAnsi="Calibri Light" w:cs="Calibri Light"/>
         </w:rPr>
         <w:t>Maleficious</w:t>
       </w:r>
-      <w:proofErr w:type="spellEnd"/>
     </w:p>
     <w:p>
       <w:pPr>
@@ -3565,21 +3356,7 @@
         <w:rPr>
           <w:rFonts w:ascii="Calibri Light" w:hAnsi="Calibri Light" w:cs="Calibri Light"/>
         </w:rPr>
-        <w:t xml:space="preserve">Al principio, enlace a </w:t>
-      </w:r>
-      <w:proofErr w:type="spellStart"/>
-      <w:r>
-        <w:rPr>
-          <w:rFonts w:ascii="Calibri Light" w:hAnsi="Calibri Light" w:cs="Calibri Light"/>
-        </w:rPr>
-        <w:t>pagina</w:t>
-      </w:r>
-      <w:proofErr w:type="spellEnd"/>
-      <w:r>
-        <w:rPr>
-          <w:rFonts w:ascii="Calibri Light" w:hAnsi="Calibri Light" w:cs="Calibri Light"/>
-        </w:rPr>
-        <w:t xml:space="preserve"> de brujas para ver todos los maleficios uno por uno</w:t>
+        <w:t>Al principio, enlace a pagina de brujas para ver todos los maleficios uno por uno</w:t>
       </w:r>
     </w:p>
     <w:p>
@@ -3842,15 +3619,7 @@
         <w:pStyle w:val="aclaraao"/>
       </w:pPr>
       <w:r>
-        <w:t xml:space="preserve">Falta hablar de que cuando matas a un </w:t>
-      </w:r>
-      <w:proofErr w:type="spellStart"/>
-      <w:r>
-        <w:t>subdito</w:t>
-      </w:r>
-      <w:proofErr w:type="spellEnd"/>
-      <w:r>
-        <w:t xml:space="preserve"> le haces uno de daño a la bruja de su baldosa. Y explicar el caso de los gemelos que le hace daño a ambos</w:t>
+        <w:t>Falta hablar de que cuando matas a un subdito le haces uno de daño a la bruja de su baldosa. Y explicar el caso de los gemelos que le hace daño a ambos</w:t>
       </w:r>
     </w:p>
     <w:p>
@@ -4003,7 +3772,6 @@
           <w:rFonts w:ascii="Calibri Light" w:hAnsi="Calibri Light" w:cs="Calibri Light"/>
         </w:rPr>
       </w:pPr>
-      <w:proofErr w:type="gramStart"/>
       <w:r>
         <w:rPr>
           <w:rFonts w:ascii="Calibri Light" w:hAnsi="Calibri Light" w:cs="Calibri Light"/>
@@ -4011,7 +3779,6 @@
         <w:lastRenderedPageBreak/>
         <w:t>Salud?</w:t>
       </w:r>
-      <w:proofErr w:type="gramEnd"/>
     </w:p>
     <w:p>
       <w:pPr>
@@ -4065,6 +3832,19 @@
           <w:rFonts w:ascii="Calibri Light" w:hAnsi="Calibri Light" w:cs="Calibri Light"/>
         </w:rPr>
       </w:pPr>
+      <w:r>
+        <w:rPr>
+          <w:rFonts w:ascii="Calibri Light" w:hAnsi="Calibri Light" w:cs="Calibri Light"/>
+        </w:rPr>
+        <w:t>En el momento que un jugador quede abatido, retira todos sus estados alterados</w:t>
+      </w:r>
+    </w:p>
+    <w:p>
+      <w:pPr>
+        <w:rPr>
+          <w:rFonts w:ascii="Calibri Light" w:hAnsi="Calibri Light" w:cs="Calibri Light"/>
+        </w:rPr>
+      </w:pPr>
     </w:p>
     <w:p>
       <w:pPr>
@@ -4176,22 +3956,115 @@
         <w:rPr>
           <w:rFonts w:ascii="Calibri Light" w:hAnsi="Calibri Light" w:cs="Calibri Light"/>
         </w:rPr>
-        <w:t xml:space="preserve">el </w:t>
-      </w:r>
-      <w:proofErr w:type="gramStart"/>
-      <w:r>
-        <w:rPr>
-          <w:rFonts w:ascii="Calibri Light" w:hAnsi="Calibri Light" w:cs="Calibri Light"/>
-        </w:rPr>
-        <w:t>doblón</w:t>
-      </w:r>
-      <w:r>
-        <w:rPr>
-          <w:rFonts w:ascii="Calibri Light" w:hAnsi="Calibri Light" w:cs="Calibri Light"/>
-        </w:rPr>
-        <w:t xml:space="preserve"> situada encima</w:t>
-      </w:r>
-      <w:proofErr w:type="gramEnd"/>
+        <w:t>el doblón</w:t>
+      </w:r>
+      <w:r>
+        <w:rPr>
+          <w:rFonts w:ascii="Calibri Light" w:hAnsi="Calibri Light" w:cs="Calibri Light"/>
+        </w:rPr>
+        <w:t xml:space="preserve"> situada encima.</w:t>
+      </w:r>
+    </w:p>
+    <w:p>
+      <w:pPr>
+        <w:rPr>
+          <w:rFonts w:ascii="Calibri Light" w:hAnsi="Calibri Light" w:cs="Calibri Light"/>
+        </w:rPr>
+      </w:pPr>
+      <w:r>
+        <w:rPr>
+          <w:rFonts w:ascii="Calibri Light" w:hAnsi="Calibri Light" w:cs="Calibri Light"/>
+        </w:rPr>
+        <w:t xml:space="preserve">Siempre que una bruja tenga vida igual o inferior </w:t>
+      </w:r>
+      <w:r>
+        <w:rPr>
+          <w:rFonts w:ascii="Calibri Light" w:hAnsi="Calibri Light" w:cs="Calibri Light"/>
+        </w:rPr>
+        <w:t>a</w:t>
+      </w:r>
+      <w:r>
+        <w:rPr>
+          <w:rFonts w:ascii="Calibri Light" w:hAnsi="Calibri Light" w:cs="Calibri Light"/>
+        </w:rPr>
+        <w:t xml:space="preserve">l umbral de pasiva, el efecto de ésta se activará. Si la bruja muere o se cura por encima </w:t>
+      </w:r>
+      <w:r>
+        <w:rPr>
+          <w:rFonts w:ascii="Calibri Light" w:hAnsi="Calibri Light" w:cs="Calibri Light"/>
+        </w:rPr>
+        <w:t>del umbral</w:t>
+      </w:r>
+      <w:r>
+        <w:rPr>
+          <w:rFonts w:ascii="Calibri Light" w:hAnsi="Calibri Light" w:cs="Calibri Light"/>
+        </w:rPr>
+        <w:t>, la pasiva se desactivará.</w:t>
+      </w:r>
+    </w:p>
+    <w:p>
+      <w:pPr>
+        <w:rPr>
+          <w:rFonts w:ascii="Calibri Light" w:hAnsi="Calibri Light" w:cs="Calibri Light"/>
+        </w:rPr>
+      </w:pPr>
+      <w:r>
+        <w:rPr>
+          <w:rFonts w:ascii="Calibri Light" w:hAnsi="Calibri Light" w:cs="Calibri Light"/>
+        </w:rPr>
+        <w:t xml:space="preserve">Cuando una bruja muere, retirad su baldosa y tableta de la mesa junto a todo lo que hubiese encima. Por último, quitad sus cartas de maleficio del mazo y </w:t>
+      </w:r>
+      <w:r>
+        <w:rPr>
+          <w:rFonts w:ascii="Calibri Light" w:hAnsi="Calibri Light" w:cs="Calibri Light"/>
+        </w:rPr>
+        <w:t>volvedlo a barajar</w:t>
+      </w:r>
+      <w:r>
+        <w:rPr>
+          <w:rFonts w:ascii="Calibri Light" w:hAnsi="Calibri Light" w:cs="Calibri Light"/>
+        </w:rPr>
+        <w:t>. </w:t>
+      </w:r>
+      <w:r>
+        <w:rPr>
+          <w:rStyle w:val="aclaraaoChar"/>
+          <w:rFonts w:ascii="Calibri Light" w:hAnsi="Calibri Light" w:cs="Calibri Light"/>
+        </w:rPr>
+        <w:t>(esto hay que mirarlo porque si lo barajan mal pueden causar que vuelva a salir una ulti que había salido sin haber rotado todas las cartas)</w:t>
+      </w:r>
+    </w:p>
+    <w:p>
+      <w:pPr>
+        <w:rPr>
+          <w:rFonts w:ascii="Calibri Light" w:hAnsi="Calibri Light" w:cs="Calibri Light"/>
+        </w:rPr>
+      </w:pPr>
+      <w:r>
+        <w:rPr>
+          <w:rFonts w:ascii="Calibri Light" w:hAnsi="Calibri Light" w:cs="Calibri Light"/>
+        </w:rPr>
+        <w:t>Si al retirar una baldosa las restantes quedan desconectadas, juntadlas haciendo el movimiento más corto posible hasta que vuelvan a estar en contacto.</w:t>
+      </w:r>
+    </w:p>
+    <w:p>
+      <w:pPr>
+        <w:rPr>
+          <w:rFonts w:ascii="Calibri Light" w:hAnsi="Calibri Light" w:cs="Calibri Light"/>
+        </w:rPr>
+      </w:pPr>
+      <w:r>
+        <w:rPr>
+          <w:rFonts w:ascii="Calibri Light" w:hAnsi="Calibri Light" w:cs="Calibri Light"/>
+        </w:rPr>
+        <w:t>Si algún jugador queda desalojado, debe elegir una casilla de otra baldosa del tablero</w:t>
+      </w:r>
+      <w:r>
+        <w:rPr>
+          <w:rFonts w:ascii="Calibri Light" w:hAnsi="Calibri Light" w:cs="Calibri Light"/>
+        </w:rPr>
+        <w:t xml:space="preserve"> a la que teletransportarse</w:t>
+      </w:r>
       <w:r>
         <w:rPr>
           <w:rFonts w:ascii="Calibri Light" w:hAnsi="Calibri Light" w:cs="Calibri Light"/>
@@ -4205,129 +4078,6 @@
           <w:rFonts w:ascii="Calibri Light" w:hAnsi="Calibri Light" w:cs="Calibri Light"/>
         </w:rPr>
       </w:pPr>
-      <w:r>
-        <w:rPr>
-          <w:rFonts w:ascii="Calibri Light" w:hAnsi="Calibri Light" w:cs="Calibri Light"/>
-        </w:rPr>
-        <w:t xml:space="preserve">Siempre que una bruja tenga vida igual o inferior </w:t>
-      </w:r>
-      <w:r>
-        <w:rPr>
-          <w:rFonts w:ascii="Calibri Light" w:hAnsi="Calibri Light" w:cs="Calibri Light"/>
-        </w:rPr>
-        <w:t>a</w:t>
-      </w:r>
-      <w:r>
-        <w:rPr>
-          <w:rFonts w:ascii="Calibri Light" w:hAnsi="Calibri Light" w:cs="Calibri Light"/>
-        </w:rPr>
-        <w:t xml:space="preserve">l umbral de pasiva, el efecto de ésta se activará. Si la bruja muere o se cura por encima </w:t>
-      </w:r>
-      <w:r>
-        <w:rPr>
-          <w:rFonts w:ascii="Calibri Light" w:hAnsi="Calibri Light" w:cs="Calibri Light"/>
-        </w:rPr>
-        <w:t>del umbral</w:t>
-      </w:r>
-      <w:r>
-        <w:rPr>
-          <w:rFonts w:ascii="Calibri Light" w:hAnsi="Calibri Light" w:cs="Calibri Light"/>
-        </w:rPr>
-        <w:t>, la pasiva se desactivará.</w:t>
-      </w:r>
-    </w:p>
-    <w:p>
-      <w:pPr>
-        <w:rPr>
-          <w:rFonts w:ascii="Calibri Light" w:hAnsi="Calibri Light" w:cs="Calibri Light"/>
-        </w:rPr>
-      </w:pPr>
-      <w:r>
-        <w:rPr>
-          <w:rFonts w:ascii="Calibri Light" w:hAnsi="Calibri Light" w:cs="Calibri Light"/>
-        </w:rPr>
-        <w:t xml:space="preserve">Cuando una bruja muere, retirad su baldosa y tableta de la mesa junto a todo lo que hubiese encima. Por último, quitad sus cartas de maleficio del mazo y </w:t>
-      </w:r>
-      <w:r>
-        <w:rPr>
-          <w:rFonts w:ascii="Calibri Light" w:hAnsi="Calibri Light" w:cs="Calibri Light"/>
-        </w:rPr>
-        <w:t>volvedlo a barajar</w:t>
-      </w:r>
-      <w:r>
-        <w:rPr>
-          <w:rFonts w:ascii="Calibri Light" w:hAnsi="Calibri Light" w:cs="Calibri Light"/>
-        </w:rPr>
-        <w:t>. </w:t>
-      </w:r>
-      <w:r>
-        <w:rPr>
-          <w:rStyle w:val="aclaraaoChar"/>
-          <w:rFonts w:ascii="Calibri Light" w:hAnsi="Calibri Light" w:cs="Calibri Light"/>
-        </w:rPr>
-        <w:t xml:space="preserve">(esto hay que mirarlo porque si lo barajan mal pueden causar que vuelva a salir una </w:t>
-      </w:r>
-      <w:proofErr w:type="spellStart"/>
-      <w:r>
-        <w:rPr>
-          <w:rStyle w:val="aclaraaoChar"/>
-          <w:rFonts w:ascii="Calibri Light" w:hAnsi="Calibri Light" w:cs="Calibri Light"/>
-        </w:rPr>
-        <w:t>ulti</w:t>
-      </w:r>
-      <w:proofErr w:type="spellEnd"/>
-      <w:r>
-        <w:rPr>
-          <w:rStyle w:val="aclaraaoChar"/>
-          <w:rFonts w:ascii="Calibri Light" w:hAnsi="Calibri Light" w:cs="Calibri Light"/>
-        </w:rPr>
-        <w:t xml:space="preserve"> que había salido sin haber rotado todas las cartas)</w:t>
-      </w:r>
-    </w:p>
-    <w:p>
-      <w:pPr>
-        <w:rPr>
-          <w:rFonts w:ascii="Calibri Light" w:hAnsi="Calibri Light" w:cs="Calibri Light"/>
-        </w:rPr>
-      </w:pPr>
-      <w:r>
-        <w:rPr>
-          <w:rFonts w:ascii="Calibri Light" w:hAnsi="Calibri Light" w:cs="Calibri Light"/>
-        </w:rPr>
-        <w:t>Si al retirar una baldosa las restantes quedan desconectadas, juntadlas haciendo el movimiento más corto posible hasta que vuelvan a estar en contacto.</w:t>
-      </w:r>
-    </w:p>
-    <w:p>
-      <w:pPr>
-        <w:rPr>
-          <w:rFonts w:ascii="Calibri Light" w:hAnsi="Calibri Light" w:cs="Calibri Light"/>
-        </w:rPr>
-      </w:pPr>
-      <w:r>
-        <w:rPr>
-          <w:rFonts w:ascii="Calibri Light" w:hAnsi="Calibri Light" w:cs="Calibri Light"/>
-        </w:rPr>
-        <w:t>Si algún jugador queda desalojado, debe elegir una casilla de otra baldosa del tablero</w:t>
-      </w:r>
-      <w:r>
-        <w:rPr>
-          <w:rFonts w:ascii="Calibri Light" w:hAnsi="Calibri Light" w:cs="Calibri Light"/>
-        </w:rPr>
-        <w:t xml:space="preserve"> a la que teletransportarse</w:t>
-      </w:r>
-      <w:r>
-        <w:rPr>
-          <w:rFonts w:ascii="Calibri Light" w:hAnsi="Calibri Light" w:cs="Calibri Light"/>
-        </w:rPr>
-        <w:t>.</w:t>
-      </w:r>
-    </w:p>
-    <w:p>
-      <w:pPr>
-        <w:rPr>
-          <w:rFonts w:ascii="Calibri Light" w:hAnsi="Calibri Light" w:cs="Calibri Light"/>
-        </w:rPr>
-      </w:pPr>
     </w:p>
     <w:p>
       <w:pPr>
@@ -4340,21 +4090,7 @@
         <w:rPr>
           <w:rFonts w:ascii="Calibri Light" w:hAnsi="Calibri Light" w:cs="Calibri Light"/>
         </w:rPr>
-        <w:t xml:space="preserve">Ilustración de una bruja muriendo. Los </w:t>
-      </w:r>
-      <w:proofErr w:type="spellStart"/>
-      <w:r>
-        <w:rPr>
-          <w:rFonts w:ascii="Calibri Light" w:hAnsi="Calibri Light" w:cs="Calibri Light"/>
-        </w:rPr>
-        <w:t>minnions</w:t>
-      </w:r>
-      <w:proofErr w:type="spellEnd"/>
-      <w:r>
-        <w:rPr>
-          <w:rFonts w:ascii="Calibri Light" w:hAnsi="Calibri Light" w:cs="Calibri Light"/>
-        </w:rPr>
-        <w:t xml:space="preserve"> se quitan. Los jugadores eligen una casilla válida. Las baldosas quedan desconectadas y hay que moverlas</w:t>
+        <w:t>Ilustración de una bruja muriendo. Los minnions se quitan. Los jugadores eligen una casilla válida. Las baldosas quedan desconectadas y hay que moverlas</w:t>
       </w:r>
     </w:p>
     <w:p>
@@ -4382,7 +4118,6 @@
         <w:rPr>
           <w:rFonts w:ascii="Calibri Light" w:hAnsi="Calibri Light" w:cs="Calibri Light"/>
         </w:rPr>
-        <w:lastRenderedPageBreak/>
         <w:t> Casillas del Tablero</w:t>
       </w:r>
     </w:p>
@@ -4452,19 +4187,11 @@
           <w:rFonts w:ascii="Calibri Light" w:hAnsi="Calibri Light" w:cs="Calibri Light"/>
         </w:rPr>
       </w:pPr>
-      <w:proofErr w:type="spellStart"/>
-      <w:r>
-        <w:rPr>
-          <w:rFonts w:ascii="Calibri Light" w:hAnsi="Calibri Light" w:cs="Calibri Light"/>
-        </w:rPr>
-        <w:t>ilustracion</w:t>
-      </w:r>
-      <w:proofErr w:type="spellEnd"/>
-      <w:r>
-        <w:rPr>
-          <w:rFonts w:ascii="Calibri Light" w:hAnsi="Calibri Light" w:cs="Calibri Light"/>
-        </w:rPr>
-        <w:t xml:space="preserve"> casilla de hechizo</w:t>
+      <w:r>
+        <w:rPr>
+          <w:rFonts w:ascii="Calibri Light" w:hAnsi="Calibri Light" w:cs="Calibri Light"/>
+        </w:rPr>
+        <w:t>ilustracion casilla de hechizo</w:t>
       </w:r>
     </w:p>
     <w:p>
@@ -4515,76 +4242,44 @@
           <w:rStyle w:val="enlaseChar"/>
           <w:rFonts w:ascii="Calibri Light" w:hAnsi="Calibri Light" w:cs="Calibri Light"/>
         </w:rPr>
-        <w:t>(</w:t>
-      </w:r>
-      <w:proofErr w:type="gramStart"/>
+        <w:t>(link a artefactos)</w:t>
+      </w:r>
+      <w:r>
+        <w:rPr>
+          <w:rFonts w:ascii="Calibri Light" w:hAnsi="Calibri Light" w:cs="Calibri Light"/>
+        </w:rPr>
+        <w:t xml:space="preserve"> utilizando</w:t>
+      </w:r>
+      <w:r>
+        <w:rPr>
+          <w:rFonts w:ascii="Calibri Light" w:hAnsi="Calibri Light" w:cs="Calibri Light"/>
+        </w:rPr>
+        <w:t xml:space="preserve"> los doblones</w:t>
+      </w:r>
+      <w:r>
+        <w:rPr>
+          <w:rFonts w:ascii="Calibri Light" w:hAnsi="Calibri Light" w:cs="Calibri Light"/>
+        </w:rPr>
+        <w:t xml:space="preserve"> conseguid</w:t>
+      </w:r>
+      <w:r>
+        <w:rPr>
+          <w:rFonts w:ascii="Calibri Light" w:hAnsi="Calibri Light" w:cs="Calibri Light"/>
+        </w:rPr>
+        <w:t>o</w:t>
+      </w:r>
+      <w:r>
+        <w:rPr>
+          <w:rFonts w:ascii="Calibri Light" w:hAnsi="Calibri Light" w:cs="Calibri Light"/>
+        </w:rPr>
+        <w:t xml:space="preserve">s </w:t>
+      </w:r>
       <w:r>
         <w:rPr>
           <w:rStyle w:val="enlaseChar"/>
           <w:rFonts w:ascii="Calibri Light" w:hAnsi="Calibri Light" w:cs="Calibri Light"/>
         </w:rPr>
-        <w:t>link</w:t>
-      </w:r>
-      <w:proofErr w:type="gramEnd"/>
-      <w:r>
-        <w:rPr>
-          <w:rStyle w:val="enlaseChar"/>
-          <w:rFonts w:ascii="Calibri Light" w:hAnsi="Calibri Light" w:cs="Calibri Light"/>
-        </w:rPr>
-        <w:t xml:space="preserve"> a artefactos)</w:t>
-      </w:r>
-      <w:r>
-        <w:rPr>
-          <w:rFonts w:ascii="Calibri Light" w:hAnsi="Calibri Light" w:cs="Calibri Light"/>
-        </w:rPr>
-        <w:t xml:space="preserve"> utilizando</w:t>
-      </w:r>
-      <w:r>
-        <w:rPr>
-          <w:rFonts w:ascii="Calibri Light" w:hAnsi="Calibri Light" w:cs="Calibri Light"/>
-        </w:rPr>
-        <w:t xml:space="preserve"> los doblones</w:t>
-      </w:r>
-      <w:r>
-        <w:rPr>
-          <w:rFonts w:ascii="Calibri Light" w:hAnsi="Calibri Light" w:cs="Calibri Light"/>
-        </w:rPr>
-        <w:t xml:space="preserve"> conseguid</w:t>
-      </w:r>
-      <w:r>
-        <w:rPr>
-          <w:rFonts w:ascii="Calibri Light" w:hAnsi="Calibri Light" w:cs="Calibri Light"/>
-        </w:rPr>
-        <w:t>o</w:t>
-      </w:r>
-      <w:r>
-        <w:rPr>
-          <w:rFonts w:ascii="Calibri Light" w:hAnsi="Calibri Light" w:cs="Calibri Light"/>
-        </w:rPr>
-        <w:t xml:space="preserve">s </w:t>
-      </w:r>
-      <w:r>
-        <w:rPr>
-          <w:rStyle w:val="enlaseChar"/>
-          <w:rFonts w:ascii="Calibri Light" w:hAnsi="Calibri Light" w:cs="Calibri Light"/>
-        </w:rPr>
-        <w:t>(</w:t>
-      </w:r>
-      <w:proofErr w:type="gramStart"/>
-      <w:r>
-        <w:rPr>
-          <w:rStyle w:val="enlaseChar"/>
-          <w:rFonts w:ascii="Calibri Light" w:hAnsi="Calibri Light" w:cs="Calibri Light"/>
-        </w:rPr>
-        <w:t>link</w:t>
-      </w:r>
-      <w:proofErr w:type="gramEnd"/>
-      <w:r>
-        <w:rPr>
-          <w:rStyle w:val="enlaseChar"/>
-          <w:rFonts w:ascii="Calibri Light" w:hAnsi="Calibri Light" w:cs="Calibri Light"/>
-        </w:rPr>
-        <w:t xml:space="preserve"> a vida de brujas).</w:t>
+        <w:t>(link a vida de brujas).</w:t>
       </w:r>
       <w:r>
         <w:rPr>
@@ -4600,19 +4295,11 @@
           <w:rFonts w:ascii="Calibri Light" w:hAnsi="Calibri Light" w:cs="Calibri Light"/>
         </w:rPr>
       </w:pPr>
-      <w:proofErr w:type="spellStart"/>
-      <w:r>
-        <w:rPr>
-          <w:rFonts w:ascii="Calibri Light" w:hAnsi="Calibri Light" w:cs="Calibri Light"/>
-        </w:rPr>
-        <w:t>ilustracion</w:t>
-      </w:r>
-      <w:proofErr w:type="spellEnd"/>
-      <w:r>
-        <w:rPr>
-          <w:rFonts w:ascii="Calibri Light" w:hAnsi="Calibri Light" w:cs="Calibri Light"/>
-        </w:rPr>
-        <w:t xml:space="preserve"> casilla de tienda</w:t>
+      <w:r>
+        <w:rPr>
+          <w:rFonts w:ascii="Calibri Light" w:hAnsi="Calibri Light" w:cs="Calibri Light"/>
+        </w:rPr>
+        <w:t>ilustracion casilla de tienda</w:t>
       </w:r>
     </w:p>
     <w:p>
@@ -4662,19 +4349,11 @@
           <w:rFonts w:ascii="Calibri Light" w:hAnsi="Calibri Light" w:cs="Calibri Light"/>
         </w:rPr>
       </w:pPr>
-      <w:proofErr w:type="spellStart"/>
-      <w:r>
-        <w:rPr>
-          <w:rFonts w:ascii="Calibri Light" w:hAnsi="Calibri Light" w:cs="Calibri Light"/>
-        </w:rPr>
-        <w:t>ilustracion</w:t>
-      </w:r>
-      <w:proofErr w:type="spellEnd"/>
-      <w:r>
-        <w:rPr>
-          <w:rFonts w:ascii="Calibri Light" w:hAnsi="Calibri Light" w:cs="Calibri Light"/>
-        </w:rPr>
-        <w:t xml:space="preserve"> casilla de bruja</w:t>
+      <w:r>
+        <w:rPr>
+          <w:rFonts w:ascii="Calibri Light" w:hAnsi="Calibri Light" w:cs="Calibri Light"/>
+        </w:rPr>
+        <w:t>ilustracion casilla de bruja</w:t>
       </w:r>
     </w:p>
     <w:p>
@@ -4728,19 +4407,11 @@
           <w:rFonts w:ascii="Calibri Light" w:hAnsi="Calibri Light" w:cs="Calibri Light"/>
         </w:rPr>
       </w:pPr>
-      <w:proofErr w:type="spellStart"/>
-      <w:r>
-        <w:rPr>
-          <w:rFonts w:ascii="Calibri Light" w:hAnsi="Calibri Light" w:cs="Calibri Light"/>
-        </w:rPr>
-        <w:t>ilustracion</w:t>
-      </w:r>
-      <w:proofErr w:type="spellEnd"/>
-      <w:r>
-        <w:rPr>
-          <w:rFonts w:ascii="Calibri Light" w:hAnsi="Calibri Light" w:cs="Calibri Light"/>
-        </w:rPr>
-        <w:t xml:space="preserve"> casilla rota</w:t>
+      <w:r>
+        <w:rPr>
+          <w:rFonts w:ascii="Calibri Light" w:hAnsi="Calibri Light" w:cs="Calibri Light"/>
+        </w:rPr>
+        <w:t>ilustracion casilla rota</w:t>
       </w:r>
     </w:p>
     <w:p>
@@ -4789,7 +4460,6 @@
         <w:rPr>
           <w:rFonts w:ascii="Calibri Light" w:hAnsi="Calibri Light" w:cs="Calibri Light"/>
         </w:rPr>
-        <w:lastRenderedPageBreak/>
         <w:t>Cartas de hechizo</w:t>
       </w:r>
     </w:p>
@@ -4831,7 +4501,6 @@
         </w:rPr>
         <w:t xml:space="preserve">El daño de los distintos combos posibles viene expresado en la parte </w:t>
       </w:r>
-      <w:proofErr w:type="gramStart"/>
       <w:r>
         <w:rPr>
           <w:rStyle w:val="aclaraaoChar"/>
@@ -4850,24 +4519,7 @@
           <w:rStyle w:val="aclaraaoChar"/>
           <w:rFonts w:ascii="Calibri Light" w:hAnsi="Calibri Light" w:cs="Calibri Light"/>
         </w:rPr>
-        <w:t>(</w:t>
-      </w:r>
-      <w:proofErr w:type="spellStart"/>
-      <w:proofErr w:type="gramEnd"/>
-      <w:r>
-        <w:rPr>
-          <w:rStyle w:val="aclaraaoChar"/>
-          <w:rFonts w:ascii="Calibri Light" w:hAnsi="Calibri Light" w:cs="Calibri Light"/>
-        </w:rPr>
-        <w:t>maybe</w:t>
-      </w:r>
-      <w:proofErr w:type="spellEnd"/>
-      <w:r>
-        <w:rPr>
-          <w:rStyle w:val="aclaraaoChar"/>
-          <w:rFonts w:ascii="Calibri Light" w:hAnsi="Calibri Light" w:cs="Calibri Light"/>
-        </w:rPr>
-        <w:t xml:space="preserve"> no es inferior)</w:t>
+        <w:t>(maybe no es inferior)</w:t>
       </w:r>
       <w:r>
         <w:rPr>
@@ -4954,29 +4606,72 @@
           <w:rStyle w:val="aclaraaoChar"/>
           <w:rFonts w:ascii="Calibri Light" w:hAnsi="Calibri Light" w:cs="Calibri Light"/>
         </w:rPr>
-        <w:t xml:space="preserve">(iconito de </w:t>
-      </w:r>
-      <w:proofErr w:type="gramStart"/>
+        <w:t>(iconito de impacto )</w:t>
+      </w:r>
+    </w:p>
+    <w:p>
+      <w:pPr>
+        <w:rPr>
+          <w:rFonts w:ascii="Calibri Light" w:hAnsi="Calibri Light" w:cs="Calibri Light"/>
+        </w:rPr>
+      </w:pPr>
+      <w:r>
+        <w:rPr>
+          <w:rFonts w:ascii="Calibri Light" w:hAnsi="Calibri Light" w:cs="Calibri Light"/>
+        </w:rPr>
+        <w:t xml:space="preserve">Hechizo de alcance infinito que ataca en línea recta y causa daño al primer enemigo golpeado. </w:t>
+      </w:r>
+    </w:p>
+    <w:p>
+      <w:pPr>
+        <w:pStyle w:val="Heading2"/>
+        <w:rPr>
+          <w:rFonts w:ascii="Calibri Light" w:hAnsi="Calibri Light" w:cs="Calibri Light"/>
+        </w:rPr>
+      </w:pPr>
+      <w:r>
+        <w:rPr>
+          <w:rFonts w:ascii="Calibri Light" w:hAnsi="Calibri Light" w:cs="Calibri Light"/>
+        </w:rPr>
+        <w:t>Colmillo</w:t>
+      </w:r>
+      <w:r>
+        <w:rPr>
+          <w:rFonts w:ascii="Calibri Light" w:hAnsi="Calibri Light" w:cs="Calibri Light"/>
+        </w:rPr>
+        <w:t xml:space="preserve"> </w:t>
+      </w:r>
       <w:r>
         <w:rPr>
           <w:rStyle w:val="aclaraaoChar"/>
           <w:rFonts w:ascii="Calibri Light" w:hAnsi="Calibri Light" w:cs="Calibri Light"/>
         </w:rPr>
-        <w:t>impacto )</w:t>
-      </w:r>
-      <w:proofErr w:type="gramEnd"/>
-    </w:p>
-    <w:p>
-      <w:pPr>
-        <w:rPr>
-          <w:rFonts w:ascii="Calibri Light" w:hAnsi="Calibri Light" w:cs="Calibri Light"/>
-        </w:rPr>
-      </w:pPr>
-      <w:r>
-        <w:rPr>
-          <w:rFonts w:ascii="Calibri Light" w:hAnsi="Calibri Light" w:cs="Calibri Light"/>
-        </w:rPr>
-        <w:t xml:space="preserve">Hechizo de alcance infinito que ataca en línea recta y causa daño al primer enemigo golpeado. </w:t>
+        <w:t>(iconito de colmillo )</w:t>
+      </w:r>
+    </w:p>
+    <w:p>
+      <w:pPr>
+        <w:rPr>
+          <w:rFonts w:ascii="Calibri Light" w:hAnsi="Calibri Light" w:cs="Calibri Light"/>
+        </w:rPr>
+      </w:pPr>
+      <w:r>
+        <w:rPr>
+          <w:rFonts w:ascii="Calibri Light" w:hAnsi="Calibri Light" w:cs="Calibri Light"/>
+        </w:rPr>
+        <w:t xml:space="preserve">Hechizo cuerpo a cuerpo que causa daño a un enemigo en una casilla adyacente. Tras usarlo, </w:t>
+      </w:r>
+      <w:r>
+        <w:rPr>
+          <w:rFonts w:ascii="Calibri Light" w:hAnsi="Calibri Light" w:cs="Calibri Light"/>
+        </w:rPr>
+        <w:t>el</w:t>
+      </w:r>
+      <w:r>
+        <w:rPr>
+          <w:rFonts w:ascii="Calibri Light" w:hAnsi="Calibri Light" w:cs="Calibri Light"/>
+        </w:rPr>
+        <w:t xml:space="preserve"> novicio gana una acción adicional.</w:t>
       </w:r>
     </w:p>
     <w:p>
@@ -4990,7 +4685,7 @@
         <w:rPr>
           <w:rFonts w:ascii="Calibri Light" w:hAnsi="Calibri Light" w:cs="Calibri Light"/>
         </w:rPr>
-        <w:t>Colmillo</w:t>
+        <w:t>Cacería</w:t>
       </w:r>
       <w:r>
         <w:rPr>
@@ -5003,41 +4698,72 @@
           <w:rStyle w:val="aclaraaoChar"/>
           <w:rFonts w:ascii="Calibri Light" w:hAnsi="Calibri Light" w:cs="Calibri Light"/>
         </w:rPr>
-        <w:t xml:space="preserve">(iconito de </w:t>
-      </w:r>
-      <w:proofErr w:type="gramStart"/>
+        <w:t>(iconito de cacería)</w:t>
+      </w:r>
+    </w:p>
+    <w:p>
+      <w:pPr>
+        <w:rPr>
+          <w:rFonts w:ascii="Calibri Light" w:hAnsi="Calibri Light" w:cs="Calibri Light"/>
+        </w:rPr>
+      </w:pPr>
+      <w:r>
+        <w:rPr>
+          <w:rFonts w:ascii="Calibri Light" w:hAnsi="Calibri Light" w:cs="Calibri Light"/>
+        </w:rPr>
+        <w:t xml:space="preserve">Hechizo teledirigido de doble objetivo. El jugador tiene hasta cinco casillas para trazar la trayectoria del proyectil. Después del primer impacto, puede volver a dirigirlo otras cinco casillas para dañar a un enemigo </w:t>
+      </w:r>
+      <w:r>
+        <w:rPr>
+          <w:rFonts w:ascii="Calibri Light" w:hAnsi="Calibri Light" w:cs="Calibri Light"/>
+        </w:rPr>
+        <w:t>distinto</w:t>
+      </w:r>
+      <w:r>
+        <w:rPr>
+          <w:rFonts w:ascii="Calibri Light" w:hAnsi="Calibri Light" w:cs="Calibri Light"/>
+        </w:rPr>
+        <w:t>.</w:t>
+      </w:r>
+    </w:p>
+    <w:p>
+      <w:pPr>
+        <w:pStyle w:val="Heading2"/>
+        <w:rPr>
+          <w:rFonts w:ascii="Calibri Light" w:hAnsi="Calibri Light" w:cs="Calibri Light"/>
+        </w:rPr>
+      </w:pPr>
+      <w:r>
+        <w:rPr>
+          <w:rFonts w:ascii="Calibri Light" w:hAnsi="Calibri Light" w:cs="Calibri Light"/>
+        </w:rPr>
+        <w:t>Diluvio</w:t>
+      </w:r>
+      <w:r>
+        <w:rPr>
+          <w:rFonts w:ascii="Calibri Light" w:hAnsi="Calibri Light" w:cs="Calibri Light"/>
+        </w:rPr>
+        <w:t xml:space="preserve"> </w:t>
+      </w:r>
       <w:r>
         <w:rPr>
           <w:rStyle w:val="aclaraaoChar"/>
           <w:rFonts w:ascii="Calibri Light" w:hAnsi="Calibri Light" w:cs="Calibri Light"/>
         </w:rPr>
-        <w:t>colmillo )</w:t>
-      </w:r>
-      <w:proofErr w:type="gramEnd"/>
-    </w:p>
-    <w:p>
-      <w:pPr>
-        <w:rPr>
-          <w:rFonts w:ascii="Calibri Light" w:hAnsi="Calibri Light" w:cs="Calibri Light"/>
-        </w:rPr>
-      </w:pPr>
-      <w:r>
-        <w:rPr>
-          <w:rFonts w:ascii="Calibri Light" w:hAnsi="Calibri Light" w:cs="Calibri Light"/>
-        </w:rPr>
-        <w:t xml:space="preserve">Hechizo cuerpo a cuerpo que causa daño a un enemigo en una casilla adyacente. Tras usarlo, </w:t>
-      </w:r>
-      <w:r>
-        <w:rPr>
-          <w:rFonts w:ascii="Calibri Light" w:hAnsi="Calibri Light" w:cs="Calibri Light"/>
-        </w:rPr>
-        <w:t>el</w:t>
-      </w:r>
-      <w:r>
-        <w:rPr>
-          <w:rFonts w:ascii="Calibri Light" w:hAnsi="Calibri Light" w:cs="Calibri Light"/>
-        </w:rPr>
-        <w:t xml:space="preserve"> novicio gana una acción adicional.</w:t>
+        <w:t>(iconito de diluvio)</w:t>
+      </w:r>
+    </w:p>
+    <w:p>
+      <w:pPr>
+        <w:rPr>
+          <w:rFonts w:ascii="Calibri Light" w:hAnsi="Calibri Light" w:cs="Calibri Light"/>
+        </w:rPr>
+      </w:pPr>
+      <w:r>
+        <w:rPr>
+          <w:rFonts w:ascii="Calibri Light" w:hAnsi="Calibri Light" w:cs="Calibri Light"/>
+        </w:rPr>
+        <w:t>Hechizo en área de rango infinito. Tras causar daño a un enemigo en cualquier casilla del tablero, elige hasta tres enemigos adyacentes al objetivo y cáusales 1 punto de daño también.</w:t>
       </w:r>
     </w:p>
     <w:p>
@@ -5051,7 +4777,7 @@
         <w:rPr>
           <w:rFonts w:ascii="Calibri Light" w:hAnsi="Calibri Light" w:cs="Calibri Light"/>
         </w:rPr>
-        <w:t>Cacería</w:t>
+        <w:t>Transfusión</w:t>
       </w:r>
       <w:r>
         <w:rPr>
@@ -5064,109 +4790,8 @@
           <w:rStyle w:val="aclaraaoChar"/>
           <w:rFonts w:ascii="Calibri Light" w:hAnsi="Calibri Light" w:cs="Calibri Light"/>
         </w:rPr>
-        <w:t>(iconito de cacería)</w:t>
-      </w:r>
-    </w:p>
-    <w:p>
-      <w:pPr>
-        <w:rPr>
-          <w:rFonts w:ascii="Calibri Light" w:hAnsi="Calibri Light" w:cs="Calibri Light"/>
-        </w:rPr>
-      </w:pPr>
-      <w:r>
-        <w:rPr>
-          <w:rFonts w:ascii="Calibri Light" w:hAnsi="Calibri Light" w:cs="Calibri Light"/>
-        </w:rPr>
-        <w:t xml:space="preserve">Hechizo teledirigido de doble objetivo. El jugador tiene hasta cinco casillas para trazar la trayectoria del proyectil. Después del primer impacto, puede volver a dirigirlo otras cinco casillas para dañar a un enemigo </w:t>
-      </w:r>
-      <w:r>
-        <w:rPr>
-          <w:rFonts w:ascii="Calibri Light" w:hAnsi="Calibri Light" w:cs="Calibri Light"/>
-        </w:rPr>
-        <w:t>distinto</w:t>
-      </w:r>
-      <w:r>
-        <w:rPr>
-          <w:rFonts w:ascii="Calibri Light" w:hAnsi="Calibri Light" w:cs="Calibri Light"/>
-        </w:rPr>
-        <w:t>.</w:t>
-      </w:r>
-    </w:p>
-    <w:p>
-      <w:pPr>
-        <w:pStyle w:val="Heading2"/>
-        <w:rPr>
-          <w:rFonts w:ascii="Calibri Light" w:hAnsi="Calibri Light" w:cs="Calibri Light"/>
-        </w:rPr>
-      </w:pPr>
-      <w:r>
-        <w:rPr>
-          <w:rFonts w:ascii="Calibri Light" w:hAnsi="Calibri Light" w:cs="Calibri Light"/>
-        </w:rPr>
-        <w:t>Diluvio</w:t>
-      </w:r>
-      <w:r>
-        <w:rPr>
-          <w:rFonts w:ascii="Calibri Light" w:hAnsi="Calibri Light" w:cs="Calibri Light"/>
-        </w:rPr>
-        <w:t xml:space="preserve"> </w:t>
-      </w:r>
-      <w:r>
-        <w:rPr>
-          <w:rStyle w:val="aclaraaoChar"/>
-          <w:rFonts w:ascii="Calibri Light" w:hAnsi="Calibri Light" w:cs="Calibri Light"/>
-        </w:rPr>
-        <w:t>(iconito de diluvio)</w:t>
-      </w:r>
-    </w:p>
-    <w:p>
-      <w:pPr>
-        <w:rPr>
-          <w:rFonts w:ascii="Calibri Light" w:hAnsi="Calibri Light" w:cs="Calibri Light"/>
-        </w:rPr>
-      </w:pPr>
-      <w:r>
-        <w:rPr>
-          <w:rFonts w:ascii="Calibri Light" w:hAnsi="Calibri Light" w:cs="Calibri Light"/>
-        </w:rPr>
-        <w:t>Hechizo en área de rango infinito. Tras causar daño a un enemigo en cualquier casilla del tablero, elige hasta tres enemigos adyacentes al objetivo y cáusales 1 punto de daño también.</w:t>
-      </w:r>
-    </w:p>
-    <w:p>
-      <w:pPr>
-        <w:pStyle w:val="Heading2"/>
-        <w:rPr>
-          <w:rFonts w:ascii="Calibri Light" w:hAnsi="Calibri Light" w:cs="Calibri Light"/>
-        </w:rPr>
-      </w:pPr>
-      <w:r>
-        <w:rPr>
-          <w:rFonts w:ascii="Calibri Light" w:hAnsi="Calibri Light" w:cs="Calibri Light"/>
-        </w:rPr>
-        <w:t>Transfusión</w:t>
-      </w:r>
-      <w:r>
-        <w:rPr>
-          <w:rFonts w:ascii="Calibri Light" w:hAnsi="Calibri Light" w:cs="Calibri Light"/>
-        </w:rPr>
-        <w:t xml:space="preserve"> </w:t>
-      </w:r>
-      <w:r>
-        <w:rPr>
-          <w:rStyle w:val="aclaraaoChar"/>
-          <w:rFonts w:ascii="Calibri Light" w:hAnsi="Calibri Light" w:cs="Calibri Light"/>
-        </w:rPr>
-        <w:t xml:space="preserve">(iconito de </w:t>
-      </w:r>
-      <w:proofErr w:type="gramStart"/>
-      <w:r>
-        <w:rPr>
-          <w:rStyle w:val="aclaraaoChar"/>
-          <w:rFonts w:ascii="Calibri Light" w:hAnsi="Calibri Light" w:cs="Calibri Light"/>
-        </w:rPr>
-        <w:t>transfusión )</w:t>
-      </w:r>
-      <w:proofErr w:type="gramEnd"/>
+        <w:t>(iconito de transfusión )</w:t>
+      </w:r>
     </w:p>
     <w:p>
       <w:pPr>
@@ -5196,7 +4821,14 @@
         <w:rPr>
           <w:rFonts w:ascii="Calibri Light" w:hAnsi="Calibri Light" w:cs="Calibri Light"/>
         </w:rPr>
-        <w:t>línea recta de 4 casillas, atravesando enemigos a su paso. Cualquier aliado vivo que se encuentre en dicha línea será curado 1 o 2 corazones dependiendo del número de transfusiones usadas. Además, un combo de 2 transfusiones puede revivir a un compañero.</w:t>
+        <w:t xml:space="preserve">línea recta de 4 casillas, atravesando enemigos a su paso. Cualquier aliado vivo que se encuentre en dicha línea será curado 1 o 2 corazones </w:t>
+      </w:r>
+      <w:r>
+        <w:rPr>
+          <w:rFonts w:ascii="Calibri Light" w:hAnsi="Calibri Light" w:cs="Calibri Light"/>
+        </w:rPr>
+        <w:lastRenderedPageBreak/>
+        <w:t>dependiendo del número de transfusiones usadas. Además, un combo de 2 transfusiones puede revivir a un compañero.</w:t>
       </w:r>
     </w:p>
     <w:p>
@@ -5210,7 +4842,6 @@
         <w:rPr>
           <w:rFonts w:ascii="Calibri Light" w:hAnsi="Calibri Light" w:cs="Calibri Light"/>
         </w:rPr>
-        <w:lastRenderedPageBreak/>
         <w:t>Artefactos</w:t>
       </w:r>
     </w:p>
@@ -5384,17 +5015,8 @@
           <w:rStyle w:val="aclaraaoChar"/>
           <w:rFonts w:ascii="Calibri Light" w:hAnsi="Calibri Light" w:cs="Calibri Light"/>
         </w:rPr>
-        <w:t xml:space="preserve">(iconito de </w:t>
-      </w:r>
-      <w:proofErr w:type="gramStart"/>
-      <w:r>
-        <w:rPr>
-          <w:rStyle w:val="aclaraaoChar"/>
-          <w:rFonts w:ascii="Calibri Light" w:hAnsi="Calibri Light" w:cs="Calibri Light"/>
-        </w:rPr>
-        <w:t>x )</w:t>
-      </w:r>
-      <w:proofErr w:type="gramEnd"/>
+        <w:t>(iconito de x )</w:t>
+      </w:r>
     </w:p>
     <w:p>
       <w:pPr>
@@ -5514,17 +5136,8 @@
           <w:rStyle w:val="aclaraaoChar"/>
           <w:rFonts w:ascii="Calibri Light" w:hAnsi="Calibri Light" w:cs="Calibri Light"/>
         </w:rPr>
-        <w:t xml:space="preserve">(iconito de </w:t>
-      </w:r>
-      <w:proofErr w:type="gramStart"/>
-      <w:r>
-        <w:rPr>
-          <w:rStyle w:val="aclaraaoChar"/>
-          <w:rFonts w:ascii="Calibri Light" w:hAnsi="Calibri Light" w:cs="Calibri Light"/>
-        </w:rPr>
-        <w:t>x )</w:t>
-      </w:r>
-      <w:proofErr w:type="gramEnd"/>
+        <w:t>(iconito de x )</w:t>
+      </w:r>
     </w:p>
     <w:p>
       <w:pPr>
@@ -5602,17 +5215,8 @@
           <w:rStyle w:val="aclaraaoChar"/>
           <w:rFonts w:ascii="Calibri Light" w:hAnsi="Calibri Light" w:cs="Calibri Light"/>
         </w:rPr>
-        <w:t xml:space="preserve">(iconito de </w:t>
-      </w:r>
-      <w:proofErr w:type="gramStart"/>
-      <w:r>
-        <w:rPr>
-          <w:rStyle w:val="aclaraaoChar"/>
-          <w:rFonts w:ascii="Calibri Light" w:hAnsi="Calibri Light" w:cs="Calibri Light"/>
-        </w:rPr>
-        <w:t>x )</w:t>
-      </w:r>
-      <w:proofErr w:type="gramEnd"/>
+        <w:t>(iconito de x )</w:t>
+      </w:r>
     </w:p>
     <w:p>
       <w:pPr>
@@ -5682,6 +5286,7 @@
           <w:rFonts w:ascii="Calibri Light" w:hAnsi="Calibri Light" w:cs="Calibri Light"/>
           <w:lang w:eastAsia="es-ES"/>
         </w:rPr>
+        <w:lastRenderedPageBreak/>
         <w:t>Causa 9 puntos de daño a la Bruja Suprema de tu elección. Si muere, puedes repetir este ataque. Este ataque se puede encadenar varias veces.</w:t>
       </w:r>
     </w:p>
@@ -5697,7 +5302,6 @@
         <w:rPr>
           <w:rFonts w:ascii="Calibri Light" w:hAnsi="Calibri Light" w:cs="Calibri Light"/>
         </w:rPr>
-        <w:lastRenderedPageBreak/>
         <w:t xml:space="preserve">Cornucopia </w:t>
       </w:r>
       <w:r>
@@ -5705,17 +5309,8 @@
           <w:rStyle w:val="aclaraaoChar"/>
           <w:rFonts w:ascii="Calibri Light" w:hAnsi="Calibri Light" w:cs="Calibri Light"/>
         </w:rPr>
-        <w:t xml:space="preserve">(iconito de </w:t>
-      </w:r>
-      <w:proofErr w:type="gramStart"/>
-      <w:r>
-        <w:rPr>
-          <w:rStyle w:val="aclaraaoChar"/>
-          <w:rFonts w:ascii="Calibri Light" w:hAnsi="Calibri Light" w:cs="Calibri Light"/>
-        </w:rPr>
-        <w:t>x )</w:t>
-      </w:r>
-      <w:proofErr w:type="gramEnd"/>
+        <w:t>(iconito de x )</w:t>
+      </w:r>
     </w:p>
     <w:p>
       <w:pPr>
@@ -5850,17 +5445,8 @@
           <w:rStyle w:val="aclaraaoChar"/>
           <w:rFonts w:ascii="Calibri Light" w:hAnsi="Calibri Light" w:cs="Calibri Light"/>
         </w:rPr>
-        <w:t xml:space="preserve">(iconito de </w:t>
-      </w:r>
-      <w:proofErr w:type="gramStart"/>
-      <w:r>
-        <w:rPr>
-          <w:rStyle w:val="aclaraaoChar"/>
-          <w:rFonts w:ascii="Calibri Light" w:hAnsi="Calibri Light" w:cs="Calibri Light"/>
-        </w:rPr>
-        <w:t>x )</w:t>
-      </w:r>
-      <w:proofErr w:type="gramEnd"/>
+        <w:t>(iconito de x )</w:t>
+      </w:r>
     </w:p>
     <w:p>
       <w:pPr>
@@ -6013,7 +5599,6 @@
         </w:rPr>
         <w:t>🥺</w:t>
       </w:r>
-      <w:proofErr w:type="spellStart"/>
       <w:r>
         <w:rPr>
           <w:rFonts w:ascii="Calibri Light" w:hAnsi="Calibri Light" w:cs="Calibri Light"/>
@@ -6022,7 +5607,6 @@
         </w:rPr>
         <w:t>themks</w:t>
       </w:r>
-      <w:proofErr w:type="spellEnd"/>
       <w:r>
         <w:rPr>
           <w:rFonts w:ascii="Calibri Light" w:hAnsi="Calibri Light" w:cs="Calibri Light"/>
@@ -6052,19 +5636,11 @@
         </w:rPr>
         <w:t xml:space="preserve">Heredera al trono de un antiguo reino, </w:t>
       </w:r>
-      <w:proofErr w:type="spellStart"/>
-      <w:r>
-        <w:rPr>
-          <w:rFonts w:ascii="Calibri Light" w:hAnsi="Calibri Light" w:cs="Calibri Light"/>
-        </w:rPr>
-        <w:t>Sihkra</w:t>
-      </w:r>
-      <w:proofErr w:type="spellEnd"/>
-      <w:r>
-        <w:rPr>
-          <w:rFonts w:ascii="Calibri Light" w:hAnsi="Calibri Light" w:cs="Calibri Light"/>
-        </w:rPr>
-        <w:t xml:space="preserve"> </w:t>
+      <w:r>
+        <w:rPr>
+          <w:rFonts w:ascii="Calibri Light" w:hAnsi="Calibri Light" w:cs="Calibri Light"/>
+        </w:rPr>
+        <w:t xml:space="preserve">Sihkra </w:t>
       </w:r>
       <w:r>
         <w:rPr>
@@ -6181,7 +5757,6 @@
               </w:rPr>
               <w:t xml:space="preserve">, los jugadores no pueden entrar ni salir de la baldosa de </w:t>
             </w:r>
-            <w:proofErr w:type="spellStart"/>
             <w:r>
               <w:rPr>
                 <w:rFonts w:ascii="Calibri Light" w:hAnsi="Calibri Light" w:cs="Calibri Light"/>
@@ -6192,14 +5767,7 @@
               <w:rPr>
                 <w:rFonts w:ascii="Calibri Light" w:hAnsi="Calibri Light" w:cs="Calibri Light"/>
               </w:rPr>
-              <w:t>ihkra</w:t>
-            </w:r>
-            <w:proofErr w:type="spellEnd"/>
-            <w:r>
-              <w:rPr>
-                <w:rFonts w:ascii="Calibri Light" w:hAnsi="Calibri Light" w:cs="Calibri Light"/>
-              </w:rPr>
-              <w:t>.</w:t>
+              <w:t>ihkra.</w:t>
             </w:r>
             <w:r>
               <w:rPr>
@@ -7893,7 +7461,6 @@
               </w:rPr>
               <w:t xml:space="preserve"> en casillas adyacentes a la bruja más herida y cúrale </w:t>
             </w:r>
-            <w:proofErr w:type="gramStart"/>
             <w:r>
               <w:rPr>
                 <w:rFonts w:ascii="Segoe UI Emoji" w:hAnsi="Segoe UI Emoji" w:cs="Segoe UI Emoji"/>
@@ -7904,14 +7471,7 @@
               <w:rPr>
                 <w:rFonts w:ascii="Calibri Light" w:hAnsi="Calibri Light" w:cs="Calibri Light"/>
               </w:rPr>
-              <w:t xml:space="preserve">  3</w:t>
-            </w:r>
-            <w:proofErr w:type="gramEnd"/>
-            <w:r>
-              <w:rPr>
-                <w:rFonts w:ascii="Calibri Light" w:hAnsi="Calibri Light" w:cs="Calibri Light"/>
-              </w:rPr>
-              <w:t xml:space="preserve"> puntos de vida.</w:t>
+              <w:t xml:space="preserve">  3 puntos de vida.</w:t>
             </w:r>
           </w:p>
         </w:tc>
@@ -8680,19 +8240,11 @@
         </w:rPr>
         <w:t xml:space="preserve">Víctima de una maldición prohibida, </w:t>
       </w:r>
-      <w:proofErr w:type="spellStart"/>
-      <w:r>
-        <w:rPr>
-          <w:rFonts w:ascii="Calibri Light" w:hAnsi="Calibri Light" w:cs="Calibri Light"/>
-        </w:rPr>
-        <w:t>Dreadne</w:t>
-      </w:r>
-      <w:proofErr w:type="spellEnd"/>
-      <w:r>
-        <w:rPr>
-          <w:rFonts w:ascii="Calibri Light" w:hAnsi="Calibri Light" w:cs="Calibri Light"/>
-        </w:rPr>
-        <w:t xml:space="preserve"> </w:t>
+      <w:r>
+        <w:rPr>
+          <w:rFonts w:ascii="Calibri Light" w:hAnsi="Calibri Light" w:cs="Calibri Light"/>
+        </w:rPr>
+        <w:t xml:space="preserve">Dreadne </w:t>
       </w:r>
       <w:r>
         <w:rPr>
@@ -9189,16 +8741,15 @@
           <w:b/>
           <w:bCs/>
         </w:rPr>
-        <w:t xml:space="preserve">-rengloncito de </w:t>
-      </w:r>
-      <w:proofErr w:type="gramStart"/>
+        <w:t xml:space="preserve">-rengloncito de lore </w:t>
+      </w:r>
       <w:r>
         <w:rPr>
           <w:rFonts w:ascii="Calibri Light" w:hAnsi="Calibri Light" w:cs="Calibri Light"/>
           <w:b/>
           <w:bCs/>
         </w:rPr>
-        <w:t xml:space="preserve">lore </w:t>
+        <w:t xml:space="preserve">, </w:t>
       </w:r>
       <w:r>
         <w:rPr>
@@ -9206,23 +8757,6 @@
           <w:b/>
           <w:bCs/>
         </w:rPr>
-        <w:t>,</w:t>
-      </w:r>
-      <w:proofErr w:type="gramEnd"/>
-      <w:r>
-        <w:rPr>
-          <w:rFonts w:ascii="Calibri Light" w:hAnsi="Calibri Light" w:cs="Calibri Light"/>
-          <w:b/>
-          <w:bCs/>
-        </w:rPr>
-        <w:t xml:space="preserve"> </w:t>
-      </w:r>
-      <w:r>
-        <w:rPr>
-          <w:rFonts w:ascii="Calibri Light" w:hAnsi="Calibri Light" w:cs="Calibri Light"/>
-          <w:b/>
-          <w:bCs/>
-        </w:rPr>
         <w:t>estilo de juego y puntos fuertes</w:t>
       </w:r>
     </w:p>
@@ -9250,19 +8784,11 @@
         </w:rPr>
         <w:t xml:space="preserve">hace tanto que su memoria lo ha olvidado, </w:t>
       </w:r>
-      <w:proofErr w:type="spellStart"/>
-      <w:r>
-        <w:rPr>
-          <w:rFonts w:ascii="Calibri Light" w:hAnsi="Calibri Light" w:cs="Calibri Light"/>
-        </w:rPr>
-        <w:t>Ygnoste</w:t>
-      </w:r>
-      <w:proofErr w:type="spellEnd"/>
-      <w:r>
-        <w:rPr>
-          <w:rFonts w:ascii="Calibri Light" w:hAnsi="Calibri Light" w:cs="Calibri Light"/>
-        </w:rPr>
-        <w:t xml:space="preserve"> </w:t>
+      <w:r>
+        <w:rPr>
+          <w:rFonts w:ascii="Calibri Light" w:hAnsi="Calibri Light" w:cs="Calibri Light"/>
+        </w:rPr>
+        <w:t xml:space="preserve">Ygnoste </w:t>
       </w:r>
       <w:r>
         <w:rPr>
@@ -9658,21 +9184,7 @@
               <w:rPr>
                 <w:rFonts w:ascii="Calibri Light" w:hAnsi="Calibri Light" w:cs="Calibri Light"/>
               </w:rPr>
-              <w:t xml:space="preserve"> ya está </w:t>
-            </w:r>
-            <w:proofErr w:type="gramStart"/>
-            <w:r>
-              <w:rPr>
-                <w:rFonts w:ascii="Calibri Light" w:hAnsi="Calibri Light" w:cs="Calibri Light"/>
-              </w:rPr>
-              <w:t>ocupada</w:t>
-            </w:r>
-            <w:proofErr w:type="gramEnd"/>
-            <w:r>
-              <w:rPr>
-                <w:rFonts w:ascii="Calibri Light" w:hAnsi="Calibri Light" w:cs="Calibri Light"/>
-              </w:rPr>
-              <w:t xml:space="preserve"> por otro</w:t>
+              <w:t xml:space="preserve"> ya está ocupada por otro</w:t>
             </w:r>
             <w:r>
               <w:rPr>
@@ -9680,19 +9192,11 @@
               </w:rPr>
               <w:t xml:space="preserve">, </w:t>
             </w:r>
-            <w:proofErr w:type="spellStart"/>
-            <w:r>
-              <w:rPr>
-                <w:rFonts w:ascii="Calibri Light" w:hAnsi="Calibri Light" w:cs="Calibri Light"/>
-              </w:rPr>
-              <w:t>Ygnoste</w:t>
-            </w:r>
-            <w:proofErr w:type="spellEnd"/>
-            <w:r>
-              <w:rPr>
-                <w:rFonts w:ascii="Calibri Light" w:hAnsi="Calibri Light" w:cs="Calibri Light"/>
-              </w:rPr>
-              <w:t xml:space="preserve"> </w:t>
+            <w:r>
+              <w:rPr>
+                <w:rFonts w:ascii="Calibri Light" w:hAnsi="Calibri Light" w:cs="Calibri Light"/>
+              </w:rPr>
+              <w:t xml:space="preserve">Ygnoste </w:t>
             </w:r>
             <w:r>
               <w:rPr>
@@ -9838,16 +9342,15 @@
           <w:b/>
           <w:bCs/>
         </w:rPr>
-        <w:t xml:space="preserve">-rengloncito de </w:t>
-      </w:r>
-      <w:proofErr w:type="gramStart"/>
+        <w:t xml:space="preserve">-rengloncito de lore </w:t>
+      </w:r>
       <w:r>
         <w:rPr>
           <w:rFonts w:ascii="Calibri Light" w:hAnsi="Calibri Light" w:cs="Calibri Light"/>
           <w:b/>
           <w:bCs/>
         </w:rPr>
-        <w:t xml:space="preserve">lore </w:t>
+        <w:t>,</w:t>
       </w:r>
       <w:r>
         <w:rPr>
@@ -9855,23 +9358,14 @@
           <w:b/>
           <w:bCs/>
         </w:rPr>
-        <w:t>,</w:t>
-      </w:r>
-      <w:proofErr w:type="gramEnd"/>
+        <w:t xml:space="preserve"> </w:t>
+      </w:r>
       <w:r>
         <w:rPr>
           <w:rFonts w:ascii="Calibri Light" w:hAnsi="Calibri Light" w:cs="Calibri Light"/>
           <w:b/>
           <w:bCs/>
         </w:rPr>
-        <w:t xml:space="preserve"> </w:t>
-      </w:r>
-      <w:r>
-        <w:rPr>
-          <w:rFonts w:ascii="Calibri Light" w:hAnsi="Calibri Light" w:cs="Calibri Light"/>
-          <w:b/>
-          <w:bCs/>
-        </w:rPr>
         <w:t>estilo de juego y puntos fuertes</w:t>
       </w:r>
     </w:p>
@@ -9887,28 +9381,12 @@
         </w:rPr>
         <w:t xml:space="preserve">Se dice que toda Bruja de Sangre debe nacer del último aliento de su predecesor. </w:t>
       </w:r>
-      <w:proofErr w:type="spellStart"/>
-      <w:r>
-        <w:rPr>
-          <w:rFonts w:ascii="Calibri Light" w:hAnsi="Calibri Light" w:cs="Calibri Light"/>
-        </w:rPr>
-        <w:t>Zex</w:t>
-      </w:r>
-      <w:proofErr w:type="spellEnd"/>
-      <w:r>
-        <w:rPr>
-          <w:rFonts w:ascii="Calibri Light" w:hAnsi="Calibri Light" w:cs="Calibri Light"/>
-        </w:rPr>
-        <w:t xml:space="preserve"> y </w:t>
-      </w:r>
-      <w:proofErr w:type="spellStart"/>
-      <w:r>
-        <w:rPr>
-          <w:rFonts w:ascii="Calibri Light" w:hAnsi="Calibri Light" w:cs="Calibri Light"/>
-        </w:rPr>
-        <w:t>Xar</w:t>
-      </w:r>
-      <w:proofErr w:type="spellEnd"/>
+      <w:r>
+        <w:rPr>
+          <w:rFonts w:ascii="Calibri Light" w:hAnsi="Calibri Light" w:cs="Calibri Light"/>
+        </w:rPr>
+        <w:t>Zex y Xar</w:t>
+      </w:r>
       <w:r>
         <w:rPr>
           <w:rFonts w:ascii="Calibri Light" w:hAnsi="Calibri Light" w:cs="Calibri Light"/>
@@ -10163,19 +9641,11 @@
                 <w:rFonts w:ascii="Calibri Light" w:hAnsi="Calibri Light" w:cs="Calibri Light"/>
               </w:rPr>
             </w:pPr>
-            <w:proofErr w:type="spellStart"/>
-            <w:r>
-              <w:rPr>
-                <w:rFonts w:ascii="Calibri Light" w:hAnsi="Calibri Light" w:cs="Calibri Light"/>
-              </w:rPr>
-              <w:t>Zex</w:t>
-            </w:r>
-            <w:proofErr w:type="spellEnd"/>
-            <w:r>
-              <w:rPr>
-                <w:rFonts w:ascii="Calibri Light" w:hAnsi="Calibri Light" w:cs="Calibri Light"/>
-              </w:rPr>
-              <w:t xml:space="preserve"> causa 1 </w:t>
+            <w:r>
+              <w:rPr>
+                <w:rFonts w:ascii="Calibri Light" w:hAnsi="Calibri Light" w:cs="Calibri Light"/>
+              </w:rPr>
+              <w:t xml:space="preserve">Zex causa 1 </w:t>
             </w:r>
             <w:r>
               <w:rPr>
@@ -10187,21 +9657,7 @@
               <w:rPr>
                 <w:rFonts w:ascii="Calibri Light" w:hAnsi="Calibri Light" w:cs="Calibri Light"/>
               </w:rPr>
-              <w:t xml:space="preserve"> de daño en todas las casillas de hechizo. </w:t>
-            </w:r>
-            <w:proofErr w:type="spellStart"/>
-            <w:r>
-              <w:rPr>
-                <w:rFonts w:ascii="Calibri Light" w:hAnsi="Calibri Light" w:cs="Calibri Light"/>
-              </w:rPr>
-              <w:t>Xar</w:t>
-            </w:r>
-            <w:proofErr w:type="spellEnd"/>
-            <w:r>
-              <w:rPr>
-                <w:rFonts w:ascii="Calibri Light" w:hAnsi="Calibri Light" w:cs="Calibri Light"/>
-              </w:rPr>
-              <w:t xml:space="preserve"> causa 1 </w:t>
+              <w:t xml:space="preserve"> de daño en todas las casillas de hechizo. Xar causa 1 </w:t>
             </w:r>
             <w:r>
               <w:rPr>
@@ -10510,30 +9966,8 @@
         <w:rPr>
           <w:rFonts w:ascii="Calibri Light" w:hAnsi="Calibri Light" w:cs="Calibri Light"/>
         </w:rPr>
-        <w:t xml:space="preserve">2 jugadores: </w:t>
-      </w:r>
-      <w:proofErr w:type="spellStart"/>
-      <w:r>
-        <w:rPr>
-          <w:rFonts w:ascii="Calibri Light" w:hAnsi="Calibri Light" w:cs="Calibri Light"/>
-        </w:rPr>
-        <w:t>eurydice</w:t>
-      </w:r>
-      <w:proofErr w:type="spellEnd"/>
-      <w:r>
-        <w:rPr>
-          <w:rFonts w:ascii="Calibri Light" w:hAnsi="Calibri Light" w:cs="Calibri Light"/>
-        </w:rPr>
-        <w:t xml:space="preserve"> y </w:t>
-      </w:r>
-      <w:proofErr w:type="spellStart"/>
-      <w:r>
-        <w:rPr>
-          <w:rFonts w:ascii="Calibri Light" w:hAnsi="Calibri Light" w:cs="Calibri Light"/>
-        </w:rPr>
-        <w:t>sihkra</w:t>
-      </w:r>
-      <w:proofErr w:type="spellEnd"/>
+        <w:t>2 jugadores: eurydice y sihkra</w:t>
+      </w:r>
     </w:p>
     <w:p>
       <w:pPr>
@@ -10553,190 +9987,50 @@
         </w:rPr>
         <w:t xml:space="preserve"> </w:t>
       </w:r>
-      <w:proofErr w:type="spellStart"/>
-      <w:r>
-        <w:rPr>
-          <w:rFonts w:ascii="Calibri Light" w:hAnsi="Calibri Light" w:cs="Calibri Light"/>
-        </w:rPr>
-        <w:t>eurydice</w:t>
-      </w:r>
-      <w:proofErr w:type="spellEnd"/>
+      <w:r>
+        <w:rPr>
+          <w:rFonts w:ascii="Calibri Light" w:hAnsi="Calibri Light" w:cs="Calibri Light"/>
+        </w:rPr>
+        <w:t>eurydice sihkra e ygnoste</w:t>
+      </w:r>
+    </w:p>
+    <w:p>
+      <w:pPr>
+        <w:rPr>
+          <w:rFonts w:ascii="Calibri Light" w:hAnsi="Calibri Light" w:cs="Calibri Light"/>
+        </w:rPr>
+      </w:pPr>
+      <w:r>
+        <w:rPr>
+          <w:rFonts w:ascii="Calibri Light" w:hAnsi="Calibri Light" w:cs="Calibri Light"/>
+        </w:rPr>
+        <w:t>4 jugadores: eurydice sihkra ygnoste y alatria</w:t>
+      </w:r>
+    </w:p>
+    <w:p>
+      <w:pPr>
+        <w:rPr>
+          <w:rFonts w:ascii="Calibri Light" w:hAnsi="Calibri Light" w:cs="Calibri Light"/>
+        </w:rPr>
+      </w:pPr>
+      <w:r>
+        <w:rPr>
+          <w:rFonts w:ascii="Calibri Light" w:hAnsi="Calibri Light" w:cs="Calibri Light"/>
+        </w:rPr>
+        <w:t>5 jugadores:</w:t>
+      </w:r>
       <w:r>
         <w:rPr>
           <w:rFonts w:ascii="Calibri Light" w:hAnsi="Calibri Light" w:cs="Calibri Light"/>
         </w:rPr>
         <w:t xml:space="preserve"> </w:t>
       </w:r>
-      <w:proofErr w:type="spellStart"/>
-      <w:r>
-        <w:rPr>
-          <w:rFonts w:ascii="Calibri Light" w:hAnsi="Calibri Light" w:cs="Calibri Light"/>
-        </w:rPr>
-        <w:t>sihkra</w:t>
-      </w:r>
-      <w:proofErr w:type="spellEnd"/>
-      <w:r>
-        <w:rPr>
-          <w:rFonts w:ascii="Calibri Light" w:hAnsi="Calibri Light" w:cs="Calibri Light"/>
-        </w:rPr>
-        <w:t xml:space="preserve"> e </w:t>
-      </w:r>
-      <w:proofErr w:type="spellStart"/>
-      <w:r>
-        <w:rPr>
-          <w:rFonts w:ascii="Calibri Light" w:hAnsi="Calibri Light" w:cs="Calibri Light"/>
-        </w:rPr>
-        <w:t>ygnoste</w:t>
-      </w:r>
-      <w:proofErr w:type="spellEnd"/>
-    </w:p>
-    <w:p>
-      <w:pPr>
-        <w:rPr>
-          <w:rFonts w:ascii="Calibri Light" w:hAnsi="Calibri Light" w:cs="Calibri Light"/>
-        </w:rPr>
-      </w:pPr>
-      <w:r>
-        <w:rPr>
-          <w:rFonts w:ascii="Calibri Light" w:hAnsi="Calibri Light" w:cs="Calibri Light"/>
-        </w:rPr>
-        <w:t xml:space="preserve">4 jugadores: </w:t>
-      </w:r>
-      <w:proofErr w:type="spellStart"/>
-      <w:r>
-        <w:rPr>
-          <w:rFonts w:ascii="Calibri Light" w:hAnsi="Calibri Light" w:cs="Calibri Light"/>
-        </w:rPr>
-        <w:t>eurydice</w:t>
-      </w:r>
-      <w:proofErr w:type="spellEnd"/>
-      <w:r>
-        <w:rPr>
-          <w:rFonts w:ascii="Calibri Light" w:hAnsi="Calibri Light" w:cs="Calibri Light"/>
-        </w:rPr>
-        <w:t xml:space="preserve"> </w:t>
-      </w:r>
-      <w:proofErr w:type="spellStart"/>
-      <w:r>
-        <w:rPr>
-          <w:rFonts w:ascii="Calibri Light" w:hAnsi="Calibri Light" w:cs="Calibri Light"/>
-        </w:rPr>
-        <w:t>sihkra</w:t>
-      </w:r>
-      <w:proofErr w:type="spellEnd"/>
-      <w:r>
-        <w:rPr>
-          <w:rFonts w:ascii="Calibri Light" w:hAnsi="Calibri Light" w:cs="Calibri Light"/>
-        </w:rPr>
-        <w:t xml:space="preserve"> </w:t>
-      </w:r>
-      <w:proofErr w:type="spellStart"/>
-      <w:r>
-        <w:rPr>
-          <w:rFonts w:ascii="Calibri Light" w:hAnsi="Calibri Light" w:cs="Calibri Light"/>
-        </w:rPr>
-        <w:t>ygnoste</w:t>
-      </w:r>
-      <w:proofErr w:type="spellEnd"/>
-      <w:r>
-        <w:rPr>
-          <w:rFonts w:ascii="Calibri Light" w:hAnsi="Calibri Light" w:cs="Calibri Light"/>
-        </w:rPr>
-        <w:t xml:space="preserve"> y </w:t>
-      </w:r>
-      <w:proofErr w:type="spellStart"/>
-      <w:r>
-        <w:rPr>
-          <w:rFonts w:ascii="Calibri Light" w:hAnsi="Calibri Light" w:cs="Calibri Light"/>
-        </w:rPr>
-        <w:t>alatria</w:t>
-      </w:r>
-      <w:proofErr w:type="spellEnd"/>
-    </w:p>
-    <w:p>
-      <w:pPr>
-        <w:rPr>
-          <w:rFonts w:ascii="Calibri Light" w:hAnsi="Calibri Light" w:cs="Calibri Light"/>
-        </w:rPr>
-      </w:pPr>
-      <w:r>
-        <w:rPr>
-          <w:rFonts w:ascii="Calibri Light" w:hAnsi="Calibri Light" w:cs="Calibri Light"/>
-        </w:rPr>
-        <w:t>5 jugadores:</w:t>
-      </w:r>
-      <w:r>
-        <w:rPr>
-          <w:rFonts w:ascii="Calibri Light" w:hAnsi="Calibri Light" w:cs="Calibri Light"/>
-        </w:rPr>
-        <w:t xml:space="preserve"> </w:t>
-      </w:r>
-      <w:proofErr w:type="spellStart"/>
-      <w:r>
-        <w:rPr>
-          <w:rFonts w:ascii="Calibri Light" w:hAnsi="Calibri Light" w:cs="Calibri Light"/>
-        </w:rPr>
-        <w:t>eurydice</w:t>
-      </w:r>
-      <w:proofErr w:type="spellEnd"/>
-      <w:r>
-        <w:rPr>
-          <w:rFonts w:ascii="Calibri Light" w:hAnsi="Calibri Light" w:cs="Calibri Light"/>
-        </w:rPr>
-        <w:t xml:space="preserve"> </w:t>
-      </w:r>
-      <w:proofErr w:type="spellStart"/>
-      <w:r>
-        <w:rPr>
-          <w:rFonts w:ascii="Calibri Light" w:hAnsi="Calibri Light" w:cs="Calibri Light"/>
-        </w:rPr>
-        <w:t>sihkra</w:t>
-      </w:r>
-      <w:proofErr w:type="spellEnd"/>
-      <w:r>
-        <w:rPr>
-          <w:rFonts w:ascii="Calibri Light" w:hAnsi="Calibri Light" w:cs="Calibri Light"/>
-        </w:rPr>
-        <w:t xml:space="preserve"> </w:t>
-      </w:r>
-      <w:proofErr w:type="spellStart"/>
-      <w:proofErr w:type="gramStart"/>
-      <w:r>
-        <w:rPr>
-          <w:rFonts w:ascii="Calibri Light" w:hAnsi="Calibri Light" w:cs="Calibri Light"/>
-        </w:rPr>
-        <w:t>ygnoste</w:t>
-      </w:r>
-      <w:proofErr w:type="spellEnd"/>
-      <w:r>
-        <w:rPr>
-          <w:rFonts w:ascii="Calibri Light" w:hAnsi="Calibri Light" w:cs="Calibri Light"/>
-        </w:rPr>
-        <w:t xml:space="preserve">  </w:t>
-      </w:r>
-      <w:proofErr w:type="spellStart"/>
-      <w:r>
-        <w:rPr>
-          <w:rFonts w:ascii="Calibri Light" w:hAnsi="Calibri Light" w:cs="Calibri Light"/>
-        </w:rPr>
-        <w:t>alatria</w:t>
-      </w:r>
-      <w:proofErr w:type="spellEnd"/>
-      <w:proofErr w:type="gramEnd"/>
-      <w:r>
-        <w:rPr>
-          <w:rFonts w:ascii="Calibri Light" w:hAnsi="Calibri Light" w:cs="Calibri Light"/>
-        </w:rPr>
-        <w:t xml:space="preserve"> y </w:t>
-      </w:r>
-      <w:proofErr w:type="spellStart"/>
-      <w:r>
-        <w:rPr>
-          <w:rFonts w:ascii="Calibri Light" w:hAnsi="Calibri Light" w:cs="Calibri Light"/>
-        </w:rPr>
-        <w:t>dreadne</w:t>
-      </w:r>
-      <w:proofErr w:type="spellEnd"/>
+      <w:r>
+        <w:rPr>
+          <w:rFonts w:ascii="Calibri Light" w:hAnsi="Calibri Light" w:cs="Calibri Light"/>
+        </w:rPr>
+        <w:t>eurydice sihkra ygnoste  alatria y dreadne</w:t>
+      </w:r>
     </w:p>
     <w:p>
       <w:pPr>
@@ -11737,8 +11031,11 @@
       </w:tr>
     </w:tbl>
     <w:p/>
-    <w:p/>
-    <w:p/>
+    <w:p>
+      <w:r>
+        <w:t>¡</w:t>
+      </w:r>
+    </w:p>
     <w:sectPr>
       <w:pgSz w:w="11906" w:h="16838"/>
       <w:pgMar w:top="1417" w:right="1701" w:bottom="1417" w:left="1701" w:header="708" w:footer="708" w:gutter="0"/>
@@ -11750,7 +11047,7 @@
 </file>
 
 <file path=word/numbering.xml><?xml version="1.0" encoding="utf-8"?>
-<w:numbering xmlns:wpc="http://schemas.microsoft.com/office/word/2010/wordprocessingCanvas" xmlns:cx="http://schemas.microsoft.com/office/drawing/2014/chartex" xmlns:cx1="http://schemas.microsoft.com/office/drawing/2015/9/8/chartex" xmlns:cx2="http://schemas.microsoft.com/office/drawing/2015/10/21/chartex" xmlns:cx3="http://schemas.microsoft.com/office/drawing/2016/5/9/chartex" xmlns:cx4="http://schemas.microsoft.com/office/drawing/2016/5/10/chartex" xmlns:cx5="http://schemas.microsoft.com/office/drawing/2016/5/11/chartex" xmlns:cx6="http://schemas.microsoft.com/office/drawing/2016/5/12/chartex" xmlns:cx7="http://schemas.microsoft.com/office/drawing/2016/5/13/chartex" xmlns:cx8="http://schemas.microsoft.com/office/drawing/2016/5/14/chartex" xmlns:mc="http://schemas.openxmlformats.org/markup-compatibility/2006" xmlns:aink="http://schemas.microsoft.com/office/drawing/2016/ink" xmlns:am3d="http://schemas.microsoft.com/office/drawing/2017/model3d" xmlns:o="urn:schemas-microsoft-com:office:office" xmlns:oel="http://schemas.microsoft.com/office/2019/extlst" xmlns:r="http://schemas.openxmlformats.org/officeDocument/2006/relationships" xmlns:m="http://schemas.openxmlformats.org/officeDocument/2006/math" xmlns:v="urn:schemas-microsoft-com:vml" xmlns:wp14="http://schemas.microsoft.com/office/word/2010/wordprocessingDrawing" xmlns:wp="http://schemas.openxmlformats.org/drawingml/2006/wordprocessingDrawing" xmlns:w10="urn:schemas-microsoft-com:office:word" xmlns:w="http://schemas.openxmlformats.org/wordprocessingml/2006/main" xmlns:w14="http://schemas.microsoft.com/office/word/2010/wordml" xmlns:w15="http://schemas.microsoft.com/office/word/2012/wordml" xmlns:w16cei="http://schemas.microsoft.com/office/word/2026/wordml/cei" xmlns:w16cex="http://schemas.microsoft.com/office/word/2018/wordml/cex" xmlns:w16cid="http://schemas.microsoft.com/office/word/2016/wordml/cid" xmlns:w16="http://schemas.microsoft.com/office/word/2018/wordml" xmlns:w16du="http://schemas.microsoft.com/office/word/2023/wordml/word16du" xmlns:w16sdtdh="http://schemas.microsoft.com/office/word/2020/wordml/sdtdatahash" xmlns:w16sdtfl="http://schemas.microsoft.com/office/word/2024/wordml/sdtformatlock" xmlns:w16se="http://schemas.microsoft.com/office/word/2015/wordml/symex" xmlns:wpg="http://schemas.microsoft.com/office/word/2010/wordprocessingGroup" xmlns:wpi="http://schemas.microsoft.com/office/word/2010/wordprocessingInk" xmlns:wne="http://schemas.microsoft.com/office/word/2006/wordml" xmlns:wps="http://schemas.microsoft.com/office/word/2010/wordprocessingShape" mc:Ignorable="w14 w15 w16se w16cid w16 w16cex w16sdtdh w16sdtfl w16du wp14">
+<w:numbering xmlns:wpc="http://schemas.microsoft.com/office/word/2010/wordprocessingCanvas" xmlns:cx="http://schemas.microsoft.com/office/drawing/2014/chartex" xmlns:cx1="http://schemas.microsoft.com/office/drawing/2015/9/8/chartex" xmlns:cx2="http://schemas.microsoft.com/office/drawing/2015/10/21/chartex" xmlns:cx3="http://schemas.microsoft.com/office/drawing/2016/5/9/chartex" xmlns:cx4="http://schemas.microsoft.com/office/drawing/2016/5/10/chartex" xmlns:cx5="http://schemas.microsoft.com/office/drawing/2016/5/11/chartex" xmlns:cx6="http://schemas.microsoft.com/office/drawing/2016/5/12/chartex" xmlns:cx7="http://schemas.microsoft.com/office/drawing/2016/5/13/chartex" xmlns:cx8="http://schemas.microsoft.com/office/drawing/2016/5/14/chartex" xmlns:mc="http://schemas.openxmlformats.org/markup-compatibility/2006" xmlns:aink="http://schemas.microsoft.com/office/drawing/2016/ink" xmlns:am3d="http://schemas.microsoft.com/office/drawing/2017/model3d" xmlns:o="urn:schemas-microsoft-com:office:office" xmlns:oel="http://schemas.microsoft.com/office/2019/extlst" xmlns:r="http://schemas.openxmlformats.org/officeDocument/2006/relationships" xmlns:m="http://schemas.openxmlformats.org/officeDocument/2006/math" xmlns:v="urn:schemas-microsoft-com:vml" xmlns:wp14="http://schemas.microsoft.com/office/word/2010/wordprocessingDrawing" xmlns:wp="http://schemas.openxmlformats.org/drawingml/2006/wordprocessingDrawing" xmlns:w10="urn:schemas-microsoft-com:office:word" xmlns:w="http://schemas.openxmlformats.org/wordprocessingml/2006/main" xmlns:w14="http://schemas.microsoft.com/office/word/2010/wordml" xmlns:w15="http://schemas.microsoft.com/office/word/2012/wordml" xmlns:w16cex="http://schemas.microsoft.com/office/word/2018/wordml/cex" xmlns:w16cid="http://schemas.microsoft.com/office/word/2016/wordml/cid" xmlns:w16="http://schemas.microsoft.com/office/word/2018/wordml" xmlns:w16du="http://schemas.microsoft.com/office/word/2023/wordml/word16du" xmlns:w16sdtdh="http://schemas.microsoft.com/office/word/2020/wordml/sdtdatahash" xmlns:w16sdtfl="http://schemas.microsoft.com/office/word/2024/wordml/sdtformatlock" xmlns:w16se="http://schemas.microsoft.com/office/word/2015/wordml/symex" xmlns:wpg="http://schemas.microsoft.com/office/word/2010/wordprocessingGroup" xmlns:wpi="http://schemas.microsoft.com/office/word/2010/wordprocessingInk" xmlns:wne="http://schemas.microsoft.com/office/word/2006/wordml" xmlns:wps="http://schemas.microsoft.com/office/word/2010/wordprocessingShape" mc:Ignorable="w14 w15 w16se w16cid w16 w16cex w16sdtdh w16sdtfl w16du wp14">
   <w:abstractNum w:abstractNumId="0" w15:restartNumberingAfterBreak="0">
     <w:nsid w:val="19076153"/>
     <w:multiLevelType w:val="multilevel"/>
@@ -12514,6 +11811,118 @@
     </w:lvl>
   </w:abstractNum>
   <w:abstractNum w:abstractNumId="6" w15:restartNumberingAfterBreak="0">
+    <w:nsid w:val="50A640B7"/>
+    <w:multiLevelType w:val="hybridMultilevel"/>
+    <w:tmpl w:val="CA18A8F4"/>
+    <w:lvl w:ilvl="0" w:tplc="696A91FA">
+      <w:numFmt w:val="bullet"/>
+      <w:lvlText w:val="-"/>
+      <w:lvlJc w:val="left"/>
+      <w:pPr>
+        <w:ind w:left="720" w:hanging="360"/>
+      </w:pPr>
+      <w:rPr>
+        <w:rFonts w:ascii="Calibri Light" w:eastAsiaTheme="minorHAnsi" w:hAnsi="Calibri Light" w:cs="Calibri Light" w:hint="default"/>
+      </w:rPr>
+    </w:lvl>
+    <w:lvl w:ilvl="1" w:tplc="0C0A0003" w:tentative="1">
+      <w:start w:val="1"/>
+      <w:numFmt w:val="bullet"/>
+      <w:lvlText w:val="o"/>
+      <w:lvlJc w:val="left"/>
+      <w:pPr>
+        <w:ind w:left="1440" w:hanging="360"/>
+      </w:pPr>
+      <w:rPr>
+        <w:rFonts w:ascii="Courier New" w:hAnsi="Courier New" w:cs="Courier New" w:hint="default"/>
+      </w:rPr>
+    </w:lvl>
+    <w:lvl w:ilvl="2" w:tplc="0C0A0005" w:tentative="1">
+      <w:start w:val="1"/>
+      <w:numFmt w:val="bullet"/>
+      <w:lvlText w:val=""/>
+      <w:lvlJc w:val="left"/>
+      <w:pPr>
+        <w:ind w:left="2160" w:hanging="360"/>
+      </w:pPr>
+      <w:rPr>
+        <w:rFonts w:ascii="Wingdings" w:hAnsi="Wingdings" w:hint="default"/>
+      </w:rPr>
+    </w:lvl>
+    <w:lvl w:ilvl="3" w:tplc="0C0A0001" w:tentative="1">
+      <w:start w:val="1"/>
+      <w:numFmt w:val="bullet"/>
+      <w:lvlText w:val=""/>
+      <w:lvlJc w:val="left"/>
+      <w:pPr>
+        <w:ind w:left="2880" w:hanging="360"/>
+      </w:pPr>
+      <w:rPr>
+        <w:rFonts w:ascii="Symbol" w:hAnsi="Symbol" w:hint="default"/>
+      </w:rPr>
+    </w:lvl>
+    <w:lvl w:ilvl="4" w:tplc="0C0A0003" w:tentative="1">
+      <w:start w:val="1"/>
+      <w:numFmt w:val="bullet"/>
+      <w:lvlText w:val="o"/>
+      <w:lvlJc w:val="left"/>
+      <w:pPr>
+        <w:ind w:left="3600" w:hanging="360"/>
+      </w:pPr>
+      <w:rPr>
+        <w:rFonts w:ascii="Courier New" w:hAnsi="Courier New" w:cs="Courier New" w:hint="default"/>
+      </w:rPr>
+    </w:lvl>
+    <w:lvl w:ilvl="5" w:tplc="0C0A0005" w:tentative="1">
+      <w:start w:val="1"/>
+      <w:numFmt w:val="bullet"/>
+      <w:lvlText w:val=""/>
+      <w:lvlJc w:val="left"/>
+      <w:pPr>
+        <w:ind w:left="4320" w:hanging="360"/>
+      </w:pPr>
+      <w:rPr>
+        <w:rFonts w:ascii="Wingdings" w:hAnsi="Wingdings" w:hint="default"/>
+      </w:rPr>
+    </w:lvl>
+    <w:lvl w:ilvl="6" w:tplc="0C0A0001" w:tentative="1">
+      <w:start w:val="1"/>
+      <w:numFmt w:val="bullet"/>
+      <w:lvlText w:val=""/>
+      <w:lvlJc w:val="left"/>
+      <w:pPr>
+        <w:ind w:left="5040" w:hanging="360"/>
+      </w:pPr>
+      <w:rPr>
+        <w:rFonts w:ascii="Symbol" w:hAnsi="Symbol" w:hint="default"/>
+      </w:rPr>
+    </w:lvl>
+    <w:lvl w:ilvl="7" w:tplc="0C0A0003" w:tentative="1">
+      <w:start w:val="1"/>
+      <w:numFmt w:val="bullet"/>
+      <w:lvlText w:val="o"/>
+      <w:lvlJc w:val="left"/>
+      <w:pPr>
+        <w:ind w:left="5760" w:hanging="360"/>
+      </w:pPr>
+      <w:rPr>
+        <w:rFonts w:ascii="Courier New" w:hAnsi="Courier New" w:cs="Courier New" w:hint="default"/>
+      </w:rPr>
+    </w:lvl>
+    <w:lvl w:ilvl="8" w:tplc="0C0A0005" w:tentative="1">
+      <w:start w:val="1"/>
+      <w:numFmt w:val="bullet"/>
+      <w:lvlText w:val=""/>
+      <w:lvlJc w:val="left"/>
+      <w:pPr>
+        <w:ind w:left="6480" w:hanging="360"/>
+      </w:pPr>
+      <w:rPr>
+        <w:rFonts w:ascii="Wingdings" w:hAnsi="Wingdings" w:hint="default"/>
+      </w:rPr>
+    </w:lvl>
+  </w:abstractNum>
+  <w:abstractNum w:abstractNumId="7" w15:restartNumberingAfterBreak="0">
     <w:nsid w:val="5350775F"/>
     <w:multiLevelType w:val="multilevel"/>
     <w:tmpl w:val="B7A26D84"/>
@@ -12626,7 +12035,7 @@
       </w:pPr>
     </w:lvl>
   </w:abstractNum>
-  <w:abstractNum w:abstractNumId="7" w15:restartNumberingAfterBreak="0">
+  <w:abstractNum w:abstractNumId="8" w15:restartNumberingAfterBreak="0">
     <w:nsid w:val="56651F33"/>
     <w:multiLevelType w:val="multilevel"/>
     <w:tmpl w:val="5CFCB47A"/>
@@ -12739,7 +12148,7 @@
       </w:pPr>
     </w:lvl>
   </w:abstractNum>
-  <w:abstractNum w:abstractNumId="8" w15:restartNumberingAfterBreak="0">
+  <w:abstractNum w:abstractNumId="9" w15:restartNumberingAfterBreak="0">
     <w:nsid w:val="5B8552DF"/>
     <w:multiLevelType w:val="multilevel"/>
     <w:tmpl w:val="786686C0"/>
@@ -12852,7 +12261,7 @@
       </w:rPr>
     </w:lvl>
   </w:abstractNum>
-  <w:abstractNum w:abstractNumId="9" w15:restartNumberingAfterBreak="0">
+  <w:abstractNum w:abstractNumId="10" w15:restartNumberingAfterBreak="0">
     <w:nsid w:val="6066688B"/>
     <w:multiLevelType w:val="multilevel"/>
     <w:tmpl w:val="B7D6240E"/>
@@ -12965,7 +12374,7 @@
       </w:rPr>
     </w:lvl>
   </w:abstractNum>
-  <w:abstractNum w:abstractNumId="10" w15:restartNumberingAfterBreak="0">
+  <w:abstractNum w:abstractNumId="11" w15:restartNumberingAfterBreak="0">
     <w:nsid w:val="64137903"/>
     <w:multiLevelType w:val="multilevel"/>
     <w:tmpl w:val="92B81094"/>
@@ -13078,7 +12487,7 @@
       </w:pPr>
     </w:lvl>
   </w:abstractNum>
-  <w:abstractNum w:abstractNumId="11" w15:restartNumberingAfterBreak="0">
+  <w:abstractNum w:abstractNumId="12" w15:restartNumberingAfterBreak="0">
     <w:nsid w:val="64C81677"/>
     <w:multiLevelType w:val="hybridMultilevel"/>
     <w:tmpl w:val="EEB43834"/>
@@ -13167,7 +12576,119 @@
       </w:pPr>
     </w:lvl>
   </w:abstractNum>
-  <w:abstractNum w:abstractNumId="12" w15:restartNumberingAfterBreak="0">
+  <w:abstractNum w:abstractNumId="13" w15:restartNumberingAfterBreak="0">
+    <w:nsid w:val="739A1A64"/>
+    <w:multiLevelType w:val="hybridMultilevel"/>
+    <w:tmpl w:val="483E09C0"/>
+    <w:lvl w:ilvl="0" w:tplc="B7F24B82">
+      <w:numFmt w:val="bullet"/>
+      <w:lvlText w:val="-"/>
+      <w:lvlJc w:val="left"/>
+      <w:pPr>
+        <w:ind w:left="720" w:hanging="360"/>
+      </w:pPr>
+      <w:rPr>
+        <w:rFonts w:ascii="Calibri Light" w:eastAsiaTheme="minorHAnsi" w:hAnsi="Calibri Light" w:cs="Calibri Light" w:hint="default"/>
+      </w:rPr>
+    </w:lvl>
+    <w:lvl w:ilvl="1" w:tplc="0C0A0003" w:tentative="1">
+      <w:start w:val="1"/>
+      <w:numFmt w:val="bullet"/>
+      <w:lvlText w:val="o"/>
+      <w:lvlJc w:val="left"/>
+      <w:pPr>
+        <w:ind w:left="1440" w:hanging="360"/>
+      </w:pPr>
+      <w:rPr>
+        <w:rFonts w:ascii="Courier New" w:hAnsi="Courier New" w:cs="Courier New" w:hint="default"/>
+      </w:rPr>
+    </w:lvl>
+    <w:lvl w:ilvl="2" w:tplc="0C0A0005" w:tentative="1">
+      <w:start w:val="1"/>
+      <w:numFmt w:val="bullet"/>
+      <w:lvlText w:val=""/>
+      <w:lvlJc w:val="left"/>
+      <w:pPr>
+        <w:ind w:left="2160" w:hanging="360"/>
+      </w:pPr>
+      <w:rPr>
+        <w:rFonts w:ascii="Wingdings" w:hAnsi="Wingdings" w:hint="default"/>
+      </w:rPr>
+    </w:lvl>
+    <w:lvl w:ilvl="3" w:tplc="0C0A0001" w:tentative="1">
+      <w:start w:val="1"/>
+      <w:numFmt w:val="bullet"/>
+      <w:lvlText w:val=""/>
+      <w:lvlJc w:val="left"/>
+      <w:pPr>
+        <w:ind w:left="2880" w:hanging="360"/>
+      </w:pPr>
+      <w:rPr>
+        <w:rFonts w:ascii="Symbol" w:hAnsi="Symbol" w:hint="default"/>
+      </w:rPr>
+    </w:lvl>
+    <w:lvl w:ilvl="4" w:tplc="0C0A0003" w:tentative="1">
+      <w:start w:val="1"/>
+      <w:numFmt w:val="bullet"/>
+      <w:lvlText w:val="o"/>
+      <w:lvlJc w:val="left"/>
+      <w:pPr>
+        <w:ind w:left="3600" w:hanging="360"/>
+      </w:pPr>
+      <w:rPr>
+        <w:rFonts w:ascii="Courier New" w:hAnsi="Courier New" w:cs="Courier New" w:hint="default"/>
+      </w:rPr>
+    </w:lvl>
+    <w:lvl w:ilvl="5" w:tplc="0C0A0005" w:tentative="1">
+      <w:start w:val="1"/>
+      <w:numFmt w:val="bullet"/>
+      <w:lvlText w:val=""/>
+      <w:lvlJc w:val="left"/>
+      <w:pPr>
+        <w:ind w:left="4320" w:hanging="360"/>
+      </w:pPr>
+      <w:rPr>
+        <w:rFonts w:ascii="Wingdings" w:hAnsi="Wingdings" w:hint="default"/>
+      </w:rPr>
+    </w:lvl>
+    <w:lvl w:ilvl="6" w:tplc="0C0A0001" w:tentative="1">
+      <w:start w:val="1"/>
+      <w:numFmt w:val="bullet"/>
+      <w:lvlText w:val=""/>
+      <w:lvlJc w:val="left"/>
+      <w:pPr>
+        <w:ind w:left="5040" w:hanging="360"/>
+      </w:pPr>
+      <w:rPr>
+        <w:rFonts w:ascii="Symbol" w:hAnsi="Symbol" w:hint="default"/>
+      </w:rPr>
+    </w:lvl>
+    <w:lvl w:ilvl="7" w:tplc="0C0A0003" w:tentative="1">
+      <w:start w:val="1"/>
+      <w:numFmt w:val="bullet"/>
+      <w:lvlText w:val="o"/>
+      <w:lvlJc w:val="left"/>
+      <w:pPr>
+        <w:ind w:left="5760" w:hanging="360"/>
+      </w:pPr>
+      <w:rPr>
+        <w:rFonts w:ascii="Courier New" w:hAnsi="Courier New" w:cs="Courier New" w:hint="default"/>
+      </w:rPr>
+    </w:lvl>
+    <w:lvl w:ilvl="8" w:tplc="0C0A0005" w:tentative="1">
+      <w:start w:val="1"/>
+      <w:numFmt w:val="bullet"/>
+      <w:lvlText w:val=""/>
+      <w:lvlJc w:val="left"/>
+      <w:pPr>
+        <w:ind w:left="6480" w:hanging="360"/>
+      </w:pPr>
+      <w:rPr>
+        <w:rFonts w:ascii="Wingdings" w:hAnsi="Wingdings" w:hint="default"/>
+      </w:rPr>
+    </w:lvl>
+  </w:abstractNum>
+  <w:abstractNum w:abstractNumId="14" w15:restartNumberingAfterBreak="0">
     <w:nsid w:val="7F4E2D56"/>
     <w:multiLevelType w:val="multilevel"/>
     <w:tmpl w:val="F57EA710"/>
@@ -13320,16 +12841,16 @@
     <w:abstractNumId w:val="5"/>
   </w:num>
   <w:num w:numId="2" w16cid:durableId="864949612">
-    <w:abstractNumId w:val="8"/>
+    <w:abstractNumId w:val="9"/>
   </w:num>
   <w:num w:numId="3" w16cid:durableId="479349054">
-    <w:abstractNumId w:val="11"/>
+    <w:abstractNumId w:val="12"/>
   </w:num>
   <w:num w:numId="4" w16cid:durableId="950206797">
-    <w:abstractNumId w:val="9"/>
+    <w:abstractNumId w:val="10"/>
   </w:num>
   <w:num w:numId="5" w16cid:durableId="1258174284">
-    <w:abstractNumId w:val="12"/>
+    <w:abstractNumId w:val="14"/>
   </w:num>
   <w:num w:numId="6" w16cid:durableId="691033835">
     <w:abstractNumId w:val="2"/>
@@ -13344,16 +12865,22 @@
     <w:abstractNumId w:val="3"/>
   </w:num>
   <w:num w:numId="10" w16cid:durableId="1912930911">
-    <w:abstractNumId w:val="6"/>
+    <w:abstractNumId w:val="7"/>
   </w:num>
   <w:num w:numId="11" w16cid:durableId="682896405">
     <w:abstractNumId w:val="1"/>
   </w:num>
   <w:num w:numId="12" w16cid:durableId="1068846884">
-    <w:abstractNumId w:val="10"/>
+    <w:abstractNumId w:val="11"/>
   </w:num>
   <w:num w:numId="13" w16cid:durableId="443810051">
-    <w:abstractNumId w:val="7"/>
+    <w:abstractNumId w:val="8"/>
+  </w:num>
+  <w:num w:numId="14" w16cid:durableId="1361660059">
+    <w:abstractNumId w:val="6"/>
+  </w:num>
+  <w:num w:numId="15" w16cid:durableId="567229656">
+    <w:abstractNumId w:val="13"/>
   </w:num>
 </w:numbering>
 </file>

</xml_diff>